<commit_message>
relatório atualizado (faltam slides)
</commit_message>
<xml_diff>
--- a/Documentação/Relatório ML.docx
+++ b/Documentação/Relatório ML.docx
@@ -87,7 +87,7 @@
           <w:szCs w:val="24"/>
         </w:rPr>
         <w:drawing>
-          <wp:anchor distT="0" distB="0" distL="114300" distR="114300" simplePos="0" relativeHeight="251662336" behindDoc="0" locked="0" layoutInCell="1" allowOverlap="1" wp14:anchorId="7C5DB5C2" wp14:editId="7B53A4AB">
+          <wp:anchor distT="0" distB="0" distL="114300" distR="114300" simplePos="0" relativeHeight="251662336" behindDoc="0" locked="0" layoutInCell="1" allowOverlap="1" wp14:anchorId="7C5DB5C2" wp14:editId="4BF22917">
             <wp:simplePos x="0" y="0"/>
             <wp:positionH relativeFrom="margin">
               <wp:align>center</wp:align>
@@ -662,7 +662,7 @@
           <w:r>
             <w:fldChar w:fldCharType="separate"/>
           </w:r>
-          <w:hyperlink w:anchor="_Toc232830940" w:history="1">
+          <w:hyperlink w:anchor="_Toc233160069" w:history="1">
             <w:r>
               <w:rPr>
                 <w:rStyle w:val="Hyperlink"/>
@@ -703,7 +703,7 @@
               <w:rPr>
                 <w:webHidden/>
               </w:rPr>
-              <w:instrText xml:space="preserve"> PAGEREF _Toc232830940 \h </w:instrText>
+              <w:instrText xml:space="preserve"> PAGEREF _Toc233160069 \h </w:instrText>
             </w:r>
             <w:r>
               <w:rPr>
@@ -743,7 +743,7 @@
               <w14:ligatures w14:val="standardContextual"/>
             </w:rPr>
           </w:pPr>
-          <w:hyperlink w:anchor="_Toc232830941" w:history="1">
+          <w:hyperlink w:anchor="_Toc233160070" w:history="1">
             <w:r>
               <w:rPr>
                 <w:rStyle w:val="Hyperlink"/>
@@ -784,7 +784,7 @@
               <w:rPr>
                 <w:webHidden/>
               </w:rPr>
-              <w:instrText xml:space="preserve"> PAGEREF _Toc232830941 \h </w:instrText>
+              <w:instrText xml:space="preserve"> PAGEREF _Toc233160070 \h </w:instrText>
             </w:r>
             <w:r>
               <w:rPr>
@@ -824,7 +824,7 @@
               <w14:ligatures w14:val="standardContextual"/>
             </w:rPr>
           </w:pPr>
-          <w:hyperlink w:anchor="_Toc232830942" w:history="1">
+          <w:hyperlink w:anchor="_Toc233160071" w:history="1">
             <w:r>
               <w:rPr>
                 <w:rStyle w:val="Hyperlink"/>
@@ -865,7 +865,7 @@
               <w:rPr>
                 <w:webHidden/>
               </w:rPr>
-              <w:instrText xml:space="preserve"> PAGEREF _Toc232830942 \h </w:instrText>
+              <w:instrText xml:space="preserve"> PAGEREF _Toc233160071 \h </w:instrText>
             </w:r>
             <w:r>
               <w:rPr>
@@ -905,7 +905,7 @@
               <w14:ligatures w14:val="standardContextual"/>
             </w:rPr>
           </w:pPr>
-          <w:hyperlink w:anchor="_Toc232830943" w:history="1">
+          <w:hyperlink w:anchor="_Toc233160072" w:history="1">
             <w:r>
               <w:rPr>
                 <w:rStyle w:val="Hyperlink"/>
@@ -946,7 +946,7 @@
               <w:rPr>
                 <w:webHidden/>
               </w:rPr>
-              <w:instrText xml:space="preserve"> PAGEREF _Toc232830943 \h </w:instrText>
+              <w:instrText xml:space="preserve"> PAGEREF _Toc233160072 \h </w:instrText>
             </w:r>
             <w:r>
               <w:rPr>
@@ -986,7 +986,7 @@
               <w14:ligatures w14:val="standardContextual"/>
             </w:rPr>
           </w:pPr>
-          <w:hyperlink w:anchor="_Toc232830944" w:history="1">
+          <w:hyperlink w:anchor="_Toc233160073" w:history="1">
             <w:r>
               <w:rPr>
                 <w:rStyle w:val="Hyperlink"/>
@@ -1027,7 +1027,7 @@
               <w:rPr>
                 <w:webHidden/>
               </w:rPr>
-              <w:instrText xml:space="preserve"> PAGEREF _Toc232830944 \h </w:instrText>
+              <w:instrText xml:space="preserve"> PAGEREF _Toc233160073 \h </w:instrText>
             </w:r>
             <w:r>
               <w:rPr>
@@ -1067,7 +1067,7 @@
               <w14:ligatures w14:val="standardContextual"/>
             </w:rPr>
           </w:pPr>
-          <w:hyperlink w:anchor="_Toc232830945" w:history="1">
+          <w:hyperlink w:anchor="_Toc233160074" w:history="1">
             <w:r>
               <w:rPr>
                 <w:rStyle w:val="Hyperlink"/>
@@ -1108,7 +1108,7 @@
               <w:rPr>
                 <w:webHidden/>
               </w:rPr>
-              <w:instrText xml:space="preserve"> PAGEREF _Toc232830945 \h </w:instrText>
+              <w:instrText xml:space="preserve"> PAGEREF _Toc233160074 \h </w:instrText>
             </w:r>
             <w:r>
               <w:rPr>
@@ -1148,7 +1148,7 @@
               <w14:ligatures w14:val="standardContextual"/>
             </w:rPr>
           </w:pPr>
-          <w:hyperlink w:anchor="_Toc232830946" w:history="1">
+          <w:hyperlink w:anchor="_Toc233160075" w:history="1">
             <w:r>
               <w:rPr>
                 <w:rStyle w:val="Hyperlink"/>
@@ -1189,7 +1189,7 @@
               <w:rPr>
                 <w:webHidden/>
               </w:rPr>
-              <w:instrText xml:space="preserve"> PAGEREF _Toc232830946 \h </w:instrText>
+              <w:instrText xml:space="preserve"> PAGEREF _Toc233160075 \h </w:instrText>
             </w:r>
             <w:r>
               <w:rPr>
@@ -1229,7 +1229,7 @@
               <w14:ligatures w14:val="standardContextual"/>
             </w:rPr>
           </w:pPr>
-          <w:hyperlink w:anchor="_Toc232830947" w:history="1">
+          <w:hyperlink w:anchor="_Toc233160076" w:history="1">
             <w:r>
               <w:rPr>
                 <w:rStyle w:val="Hyperlink"/>
@@ -1270,7 +1270,7 @@
               <w:rPr>
                 <w:webHidden/>
               </w:rPr>
-              <w:instrText xml:space="preserve"> PAGEREF _Toc232830947 \h </w:instrText>
+              <w:instrText xml:space="preserve"> PAGEREF _Toc233160076 \h </w:instrText>
             </w:r>
             <w:r>
               <w:rPr>
@@ -1310,7 +1310,7 @@
               <w14:ligatures w14:val="standardContextual"/>
             </w:rPr>
           </w:pPr>
-          <w:hyperlink w:anchor="_Toc232830948" w:history="1">
+          <w:hyperlink w:anchor="_Toc233160077" w:history="1">
             <w:r>
               <w:rPr>
                 <w:rStyle w:val="Hyperlink"/>
@@ -1351,7 +1351,7 @@
               <w:rPr>
                 <w:webHidden/>
               </w:rPr>
-              <w:instrText xml:space="preserve"> PAGEREF _Toc232830948 \h </w:instrText>
+              <w:instrText xml:space="preserve"> PAGEREF _Toc233160077 \h </w:instrText>
             </w:r>
             <w:r>
               <w:rPr>
@@ -1368,7 +1368,7 @@
               <w:rPr>
                 <w:webHidden/>
               </w:rPr>
-              <w:t>11</w:t>
+              <w:t>12</w:t>
             </w:r>
             <w:r>
               <w:rPr>
@@ -1391,7 +1391,7 @@
               <w14:ligatures w14:val="standardContextual"/>
             </w:rPr>
           </w:pPr>
-          <w:hyperlink w:anchor="_Toc232830949" w:history="1">
+          <w:hyperlink w:anchor="_Toc233160078" w:history="1">
             <w:r>
               <w:rPr>
                 <w:rStyle w:val="Hyperlink"/>
@@ -1432,7 +1432,7 @@
               <w:rPr>
                 <w:webHidden/>
               </w:rPr>
-              <w:instrText xml:space="preserve"> PAGEREF _Toc232830949 \h </w:instrText>
+              <w:instrText xml:space="preserve"> PAGEREF _Toc233160078 \h </w:instrText>
             </w:r>
             <w:r>
               <w:rPr>
@@ -1449,7 +1449,7 @@
               <w:rPr>
                 <w:webHidden/>
               </w:rPr>
-              <w:t>12</w:t>
+              <w:t>13</w:t>
             </w:r>
             <w:r>
               <w:rPr>
@@ -1477,7 +1477,7 @@
               <w14:ligatures w14:val="standardContextual"/>
             </w:rPr>
           </w:pPr>
-          <w:hyperlink w:anchor="_Toc232830950" w:history="1">
+          <w:hyperlink w:anchor="_Toc233160079" w:history="1">
             <w:r>
               <w:rPr>
                 <w:rStyle w:val="Hyperlink"/>
@@ -1504,7 +1504,7 @@
                 <w:noProof/>
                 <w:webHidden/>
               </w:rPr>
-              <w:instrText xml:space="preserve"> PAGEREF _Toc232830950 \h </w:instrText>
+              <w:instrText xml:space="preserve"> PAGEREF _Toc233160079 \h </w:instrText>
             </w:r>
             <w:r>
               <w:rPr>
@@ -1524,7 +1524,7 @@
                 <w:noProof/>
                 <w:webHidden/>
               </w:rPr>
-              <w:t>13</w:t>
+              <w:t>14</w:t>
             </w:r>
             <w:r>
               <w:rPr>
@@ -1607,7 +1607,7 @@
       <w:pPr>
         <w:pStyle w:val="Heading2"/>
       </w:pPr>
-      <w:bookmarkStart w:id="1" w:name="_Toc232830940"/>
+      <w:bookmarkStart w:id="1" w:name="_Toc233160069"/>
       <w:bookmarkEnd w:id="0"/>
       <w:r>
         <w:lastRenderedPageBreak/>
@@ -1649,7 +1649,7 @@
       <w:pPr>
         <w:pStyle w:val="Heading2"/>
       </w:pPr>
-      <w:bookmarkStart w:id="2" w:name="_Toc232830941"/>
+      <w:bookmarkStart w:id="2" w:name="_Toc233160070"/>
       <w:r>
         <w:lastRenderedPageBreak/>
         <w:t>FUNDAMENTAÇ</w:t>
@@ -1670,7 +1670,7 @@
     </w:p>
     <w:p>
       <w:pPr>
-        <w:ind w:firstLine="0"/>
+        <w:ind w:firstLine="432"/>
       </w:pPr>
       <w:r>
         <w:t>Esta seção apresenta os conceitos que fundamentam as decisões técnicas do trabalho.</w:t>
@@ -1689,7 +1689,7 @@
           <w:numId w:val="4"/>
         </w:numPr>
       </w:pPr>
-      <w:bookmarkStart w:id="3" w:name="_Toc232830942"/>
+      <w:bookmarkStart w:id="3" w:name="_Toc233160071"/>
       <w:r>
         <w:t>DETECÇÃO DE OBJETOS E A FAMÍLIA YOLO</w:t>
       </w:r>
@@ -2087,7 +2087,27 @@
           <w:szCs w:val="24"/>
         </w:rPr>
         <w:lastRenderedPageBreak/>
-        <w:t>MÉTRICAS DE DETECÇÃO (IOU, NMS, PRECISÃO, REVOCAÇÃO E MAP)</w:t>
+        <w:t xml:space="preserve">MÉTRICAS DE DETECÇÃO (IOU, NMS, PRECISÃO, REVOCAÇÃO E </w:t>
+      </w:r>
+      <w:r>
+        <w:rPr>
+          <w:rFonts w:ascii="Arial" w:eastAsia="Arial" w:hAnsi="Arial" w:cs="Arial"/>
+          <w:b/>
+          <w:bCs/>
+          <w:sz w:val="24"/>
+          <w:szCs w:val="24"/>
+        </w:rPr>
+        <w:t>m</w:t>
+      </w:r>
+      <w:r>
+        <w:rPr>
+          <w:rFonts w:ascii="Arial" w:eastAsia="Arial" w:hAnsi="Arial" w:cs="Arial"/>
+          <w:b/>
+          <w:bCs/>
+          <w:sz w:val="24"/>
+          <w:szCs w:val="24"/>
+        </w:rPr>
+        <w:t>AP)</w:t>
       </w:r>
     </w:p>
     <w:p>
@@ -2307,7 +2327,7 @@
       <w:pPr>
         <w:pStyle w:val="Heading2"/>
       </w:pPr>
-      <w:bookmarkStart w:id="5" w:name="_Toc232830943"/>
+      <w:bookmarkStart w:id="5" w:name="_Toc233160072"/>
       <w:r>
         <w:t>METODOLOGIA</w:t>
       </w:r>
@@ -2334,7 +2354,7 @@
           <w:szCs w:val="24"/>
         </w:rPr>
       </w:pPr>
-      <w:bookmarkStart w:id="6" w:name="_Toc232830944"/>
+      <w:bookmarkStart w:id="6" w:name="_Toc233160073"/>
       <w:r>
         <w:rPr>
           <w:szCs w:val="24"/>
@@ -3547,10 +3567,25 @@
     </w:p>
     <w:p>
       <w:r>
-        <w:t xml:space="preserve">A augmentation foi aplicada somente ao conjunto de treino (rotação de 90 graus e variação de brilho de mais ou menos 20 por cento); validação e teste ficaram sem augmentation, conforme o conceito visto em aula. Os volumes finais foram [PREENCHER: N treino] imagens de treino, </w:t>
-      </w:r>
-      <w:r>
-        <w:t>40</w:t>
+        <w:t xml:space="preserve">A augmentation foi aplicada somente ao conjunto de treino (rotação de 90 graus e variação de brilho de mais ou menos 20 por cento); validação e teste ficaram sem augmentation, conforme o conceito visto em aula. Os volumes finais foram </w:t>
+      </w:r>
+      <w:r>
+        <w:t xml:space="preserve">538 </w:t>
+      </w:r>
+      <w:r>
+        <w:t>imagens de treino</w:t>
+      </w:r>
+      <w:r>
+        <w:t xml:space="preserve"> (Pós Augmentation)</w:t>
+      </w:r>
+      <w:r>
+        <w:t xml:space="preserve">, </w:t>
+      </w:r>
+      <w:r>
+        <w:t>6</w:t>
+      </w:r>
+      <w:r>
+        <w:t>0</w:t>
       </w:r>
       <w:r>
         <w:t xml:space="preserve"> de validação e </w:t>
@@ -3643,7 +3678,6 @@
                 <w:bCs/>
                 <w:sz w:val="20"/>
                 <w:szCs w:val="20"/>
-                <w:highlight w:val="yellow"/>
               </w:rPr>
             </w:pPr>
             <w:r>
@@ -3652,7 +3686,6 @@
                 <w:bCs/>
                 <w:sz w:val="20"/>
                 <w:szCs w:val="20"/>
-                <w:highlight w:val="yellow"/>
               </w:rPr>
               <w:t>Rodada</w:t>
             </w:r>
@@ -3670,7 +3703,6 @@
                 <w:bCs/>
                 <w:sz w:val="20"/>
                 <w:szCs w:val="20"/>
-                <w:highlight w:val="yellow"/>
               </w:rPr>
             </w:pPr>
             <w:r>
@@ -3679,7 +3711,6 @@
                 <w:bCs/>
                 <w:sz w:val="20"/>
                 <w:szCs w:val="20"/>
-                <w:highlight w:val="yellow"/>
               </w:rPr>
               <w:t>Modelo</w:t>
             </w:r>
@@ -3697,7 +3728,6 @@
                 <w:bCs/>
                 <w:sz w:val="20"/>
                 <w:szCs w:val="20"/>
-                <w:highlight w:val="yellow"/>
               </w:rPr>
             </w:pPr>
             <w:r>
@@ -3706,7 +3736,6 @@
                 <w:bCs/>
                 <w:sz w:val="20"/>
                 <w:szCs w:val="20"/>
-                <w:highlight w:val="yellow"/>
               </w:rPr>
               <w:t>Qtd Épocas</w:t>
             </w:r>
@@ -3724,7 +3753,6 @@
                 <w:bCs/>
                 <w:sz w:val="20"/>
                 <w:szCs w:val="20"/>
-                <w:highlight w:val="yellow"/>
               </w:rPr>
             </w:pPr>
             <w:r>
@@ -3733,7 +3761,6 @@
                 <w:bCs/>
                 <w:sz w:val="20"/>
                 <w:szCs w:val="20"/>
-                <w:highlight w:val="yellow"/>
               </w:rPr>
               <w:t>Batch</w:t>
             </w:r>
@@ -3751,7 +3778,6 @@
                 <w:bCs/>
                 <w:sz w:val="20"/>
                 <w:szCs w:val="20"/>
-                <w:highlight w:val="yellow"/>
               </w:rPr>
             </w:pPr>
             <w:r>
@@ -3760,7 +3786,6 @@
                 <w:bCs/>
                 <w:sz w:val="20"/>
                 <w:szCs w:val="20"/>
-                <w:highlight w:val="yellow"/>
               </w:rPr>
               <w:t>imgsz</w:t>
             </w:r>
@@ -3778,7 +3803,6 @@
                 <w:bCs/>
                 <w:sz w:val="20"/>
                 <w:szCs w:val="20"/>
-                <w:highlight w:val="yellow"/>
               </w:rPr>
             </w:pPr>
             <w:r>
@@ -3787,7 +3811,6 @@
                 <w:bCs/>
                 <w:sz w:val="20"/>
                 <w:szCs w:val="20"/>
-                <w:highlight w:val="yellow"/>
               </w:rPr>
               <w:t>seed</w:t>
             </w:r>
@@ -3805,7 +3828,6 @@
                 <w:bCs/>
                 <w:sz w:val="20"/>
                 <w:szCs w:val="20"/>
-                <w:highlight w:val="yellow"/>
               </w:rPr>
             </w:pPr>
             <w:r>
@@ -3814,7 +3836,6 @@
                 <w:bCs/>
                 <w:sz w:val="20"/>
                 <w:szCs w:val="20"/>
-                <w:highlight w:val="yellow"/>
               </w:rPr>
               <w:t>MAP@0.5</w:t>
             </w:r>
@@ -3832,7 +3853,6 @@
                 <w:bCs/>
                 <w:sz w:val="20"/>
                 <w:szCs w:val="20"/>
-                <w:highlight w:val="yellow"/>
               </w:rPr>
             </w:pPr>
             <w:r>
@@ -3841,7 +3861,6 @@
                 <w:bCs/>
                 <w:sz w:val="20"/>
                 <w:szCs w:val="20"/>
-                <w:highlight w:val="yellow"/>
               </w:rPr>
               <w:t>MAP@0.5.95</w:t>
             </w:r>
@@ -3862,14 +3881,12 @@
               <w:rPr>
                 <w:sz w:val="20"/>
                 <w:szCs w:val="20"/>
-                <w:highlight w:val="yellow"/>
               </w:rPr>
             </w:pPr>
             <w:r>
               <w:rPr>
                 <w:sz w:val="20"/>
                 <w:szCs w:val="20"/>
-                <w:highlight w:val="yellow"/>
               </w:rPr>
               <w:t>1</w:t>
             </w:r>
@@ -3885,14 +3902,12 @@
               <w:rPr>
                 <w:sz w:val="20"/>
                 <w:szCs w:val="20"/>
-                <w:highlight w:val="yellow"/>
               </w:rPr>
             </w:pPr>
             <w:r>
               <w:rPr>
                 <w:sz w:val="20"/>
                 <w:szCs w:val="20"/>
-                <w:highlight w:val="yellow"/>
               </w:rPr>
               <w:t>YOLO26n</w:t>
             </w:r>
@@ -3908,14 +3923,12 @@
               <w:rPr>
                 <w:sz w:val="20"/>
                 <w:szCs w:val="20"/>
-                <w:highlight w:val="yellow"/>
               </w:rPr>
             </w:pPr>
             <w:r>
               <w:rPr>
                 <w:sz w:val="20"/>
                 <w:szCs w:val="20"/>
-                <w:highlight w:val="yellow"/>
               </w:rPr>
               <w:t>30</w:t>
             </w:r>
@@ -3931,14 +3944,12 @@
               <w:rPr>
                 <w:sz w:val="20"/>
                 <w:szCs w:val="20"/>
-                <w:highlight w:val="yellow"/>
               </w:rPr>
             </w:pPr>
             <w:r>
               <w:rPr>
                 <w:sz w:val="20"/>
                 <w:szCs w:val="20"/>
-                <w:highlight w:val="yellow"/>
               </w:rPr>
               <w:t>16</w:t>
             </w:r>
@@ -3954,14 +3965,12 @@
               <w:rPr>
                 <w:sz w:val="20"/>
                 <w:szCs w:val="20"/>
-                <w:highlight w:val="yellow"/>
               </w:rPr>
             </w:pPr>
             <w:r>
               <w:rPr>
                 <w:sz w:val="20"/>
                 <w:szCs w:val="20"/>
-                <w:highlight w:val="yellow"/>
               </w:rPr>
               <w:t>640</w:t>
             </w:r>
@@ -3977,14 +3986,12 @@
               <w:rPr>
                 <w:sz w:val="20"/>
                 <w:szCs w:val="20"/>
-                <w:highlight w:val="yellow"/>
               </w:rPr>
             </w:pPr>
             <w:r>
               <w:rPr>
                 <w:sz w:val="20"/>
                 <w:szCs w:val="20"/>
-                <w:highlight w:val="yellow"/>
               </w:rPr>
               <w:t>42</w:t>
             </w:r>
@@ -4000,9 +4007,15 @@
               <w:rPr>
                 <w:sz w:val="20"/>
                 <w:szCs w:val="20"/>
-                <w:highlight w:val="yellow"/>
               </w:rPr>
             </w:pPr>
+            <w:r>
+              <w:rPr>
+                <w:sz w:val="20"/>
+                <w:szCs w:val="20"/>
+              </w:rPr>
+              <w:t>0.946</w:t>
+            </w:r>
           </w:p>
         </w:tc>
         <w:tc>
@@ -4015,9 +4028,15 @@
               <w:rPr>
                 <w:sz w:val="20"/>
                 <w:szCs w:val="20"/>
-                <w:highlight w:val="yellow"/>
               </w:rPr>
             </w:pPr>
+            <w:r>
+              <w:rPr>
+                <w:sz w:val="20"/>
+                <w:szCs w:val="20"/>
+              </w:rPr>
+              <w:t>0.729</w:t>
+            </w:r>
           </w:p>
         </w:tc>
       </w:tr>
@@ -4035,14 +4054,12 @@
               <w:rPr>
                 <w:sz w:val="20"/>
                 <w:szCs w:val="20"/>
-                <w:highlight w:val="yellow"/>
               </w:rPr>
             </w:pPr>
             <w:r>
               <w:rPr>
                 <w:sz w:val="20"/>
                 <w:szCs w:val="20"/>
-                <w:highlight w:val="yellow"/>
               </w:rPr>
               <w:t>2</w:t>
             </w:r>
@@ -4058,14 +4075,12 @@
               <w:rPr>
                 <w:sz w:val="20"/>
                 <w:szCs w:val="20"/>
-                <w:highlight w:val="yellow"/>
               </w:rPr>
             </w:pPr>
             <w:r>
               <w:rPr>
                 <w:sz w:val="20"/>
                 <w:szCs w:val="20"/>
-                <w:highlight w:val="yellow"/>
               </w:rPr>
               <w:t>YOLO26n</w:t>
             </w:r>
@@ -4081,14 +4096,12 @@
               <w:rPr>
                 <w:sz w:val="20"/>
                 <w:szCs w:val="20"/>
-                <w:highlight w:val="yellow"/>
               </w:rPr>
             </w:pPr>
             <w:r>
               <w:rPr>
                 <w:sz w:val="20"/>
                 <w:szCs w:val="20"/>
-                <w:highlight w:val="yellow"/>
               </w:rPr>
               <w:t>50</w:t>
             </w:r>
@@ -4104,14 +4117,12 @@
               <w:rPr>
                 <w:sz w:val="20"/>
                 <w:szCs w:val="20"/>
-                <w:highlight w:val="yellow"/>
               </w:rPr>
             </w:pPr>
             <w:r>
               <w:rPr>
                 <w:sz w:val="20"/>
                 <w:szCs w:val="20"/>
-                <w:highlight w:val="yellow"/>
               </w:rPr>
               <w:t>16</w:t>
             </w:r>
@@ -4127,14 +4138,12 @@
               <w:rPr>
                 <w:sz w:val="20"/>
                 <w:szCs w:val="20"/>
-                <w:highlight w:val="yellow"/>
               </w:rPr>
             </w:pPr>
             <w:r>
               <w:rPr>
                 <w:sz w:val="20"/>
                 <w:szCs w:val="20"/>
-                <w:highlight w:val="yellow"/>
               </w:rPr>
               <w:t>640</w:t>
             </w:r>
@@ -4150,14 +4159,12 @@
               <w:rPr>
                 <w:sz w:val="20"/>
                 <w:szCs w:val="20"/>
-                <w:highlight w:val="yellow"/>
               </w:rPr>
             </w:pPr>
             <w:r>
               <w:rPr>
                 <w:sz w:val="20"/>
                 <w:szCs w:val="20"/>
-                <w:highlight w:val="yellow"/>
               </w:rPr>
               <w:t>42</w:t>
             </w:r>
@@ -4173,9 +4180,15 @@
               <w:rPr>
                 <w:sz w:val="20"/>
                 <w:szCs w:val="20"/>
-                <w:highlight w:val="yellow"/>
               </w:rPr>
             </w:pPr>
+            <w:r>
+              <w:rPr>
+                <w:sz w:val="20"/>
+                <w:szCs w:val="20"/>
+              </w:rPr>
+              <w:t>0.954</w:t>
+            </w:r>
           </w:p>
         </w:tc>
         <w:tc>
@@ -4188,9 +4201,15 @@
               <w:rPr>
                 <w:sz w:val="20"/>
                 <w:szCs w:val="20"/>
-                <w:highlight w:val="yellow"/>
               </w:rPr>
             </w:pPr>
+            <w:r>
+              <w:rPr>
+                <w:sz w:val="20"/>
+                <w:szCs w:val="20"/>
+              </w:rPr>
+              <w:t>0.778</w:t>
+            </w:r>
           </w:p>
         </w:tc>
       </w:tr>
@@ -4224,7 +4243,7 @@
       <w:pPr>
         <w:pStyle w:val="Heading2"/>
       </w:pPr>
-      <w:bookmarkStart w:id="7" w:name="_Toc232830945"/>
+      <w:bookmarkStart w:id="7" w:name="_Toc233160074"/>
       <w:r>
         <w:lastRenderedPageBreak/>
         <w:t>RESULTADOS E DISCUSSÃO</w:t>
@@ -4248,7 +4267,7 @@
           <w:numId w:val="4"/>
         </w:numPr>
       </w:pPr>
-      <w:bookmarkStart w:id="8" w:name="_Toc232830946"/>
+      <w:bookmarkStart w:id="8" w:name="_Toc233160075"/>
       <w:r>
         <w:t>COMPARAÇÃO DAS RODADAS E DAS ARQUITETURAS</w:t>
       </w:r>
@@ -4289,14 +4308,12 @@
               <w:rPr>
                 <w:b/>
                 <w:bCs/>
-                <w:highlight w:val="yellow"/>
               </w:rPr>
             </w:pPr>
             <w:r>
               <w:rPr>
                 <w:b/>
                 <w:bCs/>
-                <w:highlight w:val="yellow"/>
               </w:rPr>
               <w:t>Modelo</w:t>
             </w:r>
@@ -4312,14 +4329,12 @@
               <w:rPr>
                 <w:b/>
                 <w:bCs/>
-                <w:highlight w:val="yellow"/>
               </w:rPr>
             </w:pPr>
             <w:r>
               <w:rPr>
                 <w:b/>
                 <w:bCs/>
-                <w:highlight w:val="yellow"/>
               </w:rPr>
               <w:t>mAP@0.5</w:t>
             </w:r>
@@ -4335,14 +4350,12 @@
               <w:rPr>
                 <w:b/>
                 <w:bCs/>
-                <w:highlight w:val="yellow"/>
               </w:rPr>
             </w:pPr>
             <w:r>
               <w:rPr>
                 <w:b/>
                 <w:bCs/>
-                <w:highlight w:val="yellow"/>
               </w:rPr>
               <w:t>mAP@0.5:0.95</w:t>
             </w:r>
@@ -4358,14 +4371,12 @@
               <w:rPr>
                 <w:b/>
                 <w:bCs/>
-                <w:highlight w:val="yellow"/>
               </w:rPr>
             </w:pPr>
             <w:r>
               <w:rPr>
                 <w:b/>
                 <w:bCs/>
-                <w:highlight w:val="yellow"/>
               </w:rPr>
               <w:t>Precisão</w:t>
             </w:r>
@@ -4381,14 +4392,12 @@
               <w:rPr>
                 <w:b/>
                 <w:bCs/>
-                <w:highlight w:val="yellow"/>
               </w:rPr>
             </w:pPr>
             <w:r>
               <w:rPr>
                 <w:b/>
                 <w:bCs/>
-                <w:highlight w:val="yellow"/>
               </w:rPr>
               <w:t>Revocação</w:t>
             </w:r>
@@ -4406,14 +4415,8 @@
           <w:p>
             <w:pPr>
               <w:ind w:firstLine="0"/>
-              <w:rPr>
-                <w:highlight w:val="yellow"/>
-              </w:rPr>
             </w:pPr>
             <w:r>
-              <w:rPr>
-                <w:highlight w:val="yellow"/>
-              </w:rPr>
               <w:t>YOLO26n</w:t>
             </w:r>
           </w:p>
@@ -4425,10 +4428,10 @@
           <w:p>
             <w:pPr>
               <w:ind w:firstLine="0"/>
-              <w:rPr>
-                <w:highlight w:val="yellow"/>
-              </w:rPr>
             </w:pPr>
+            <w:r>
+              <w:t>0.709</w:t>
+            </w:r>
           </w:p>
         </w:tc>
         <w:tc>
@@ -4438,10 +4441,10 @@
           <w:p>
             <w:pPr>
               <w:ind w:firstLine="0"/>
-              <w:rPr>
-                <w:highlight w:val="yellow"/>
-              </w:rPr>
             </w:pPr>
+            <w:r>
+              <w:t>0.530</w:t>
+            </w:r>
           </w:p>
         </w:tc>
         <w:tc>
@@ -4451,10 +4454,10 @@
           <w:p>
             <w:pPr>
               <w:ind w:firstLine="0"/>
-              <w:rPr>
-                <w:highlight w:val="yellow"/>
-              </w:rPr>
             </w:pPr>
+            <w:r>
+              <w:t>0.710</w:t>
+            </w:r>
           </w:p>
         </w:tc>
         <w:tc>
@@ -4464,10 +4467,10 @@
           <w:p>
             <w:pPr>
               <w:ind w:firstLine="0"/>
-              <w:rPr>
-                <w:highlight w:val="yellow"/>
-              </w:rPr>
             </w:pPr>
+            <w:r>
+              <w:t>0.817</w:t>
+            </w:r>
           </w:p>
         </w:tc>
       </w:tr>
@@ -4482,14 +4485,8 @@
           <w:p>
             <w:pPr>
               <w:ind w:firstLine="0"/>
-              <w:rPr>
-                <w:highlight w:val="yellow"/>
-              </w:rPr>
             </w:pPr>
             <w:r>
-              <w:rPr>
-                <w:highlight w:val="yellow"/>
-              </w:rPr>
               <w:t>YOLO11n</w:t>
             </w:r>
           </w:p>
@@ -4501,10 +4498,10 @@
           <w:p>
             <w:pPr>
               <w:ind w:firstLine="0"/>
-              <w:rPr>
-                <w:highlight w:val="yellow"/>
-              </w:rPr>
             </w:pPr>
+            <w:r>
+              <w:t>0.781</w:t>
+            </w:r>
           </w:p>
         </w:tc>
         <w:tc>
@@ -4514,10 +4511,10 @@
           <w:p>
             <w:pPr>
               <w:ind w:firstLine="0"/>
-              <w:rPr>
-                <w:highlight w:val="yellow"/>
-              </w:rPr>
             </w:pPr>
+            <w:r>
+              <w:t>0.536</w:t>
+            </w:r>
           </w:p>
         </w:tc>
         <w:tc>
@@ -4527,10 +4524,10 @@
           <w:p>
             <w:pPr>
               <w:ind w:firstLine="0"/>
-              <w:rPr>
-                <w:highlight w:val="yellow"/>
-              </w:rPr>
             </w:pPr>
+            <w:r>
+              <w:t>0.869</w:t>
+            </w:r>
           </w:p>
         </w:tc>
         <w:tc>
@@ -4540,10 +4537,10 @@
           <w:p>
             <w:pPr>
               <w:ind w:firstLine="0"/>
-              <w:rPr>
-                <w:highlight w:val="yellow"/>
-              </w:rPr>
             </w:pPr>
+            <w:r>
+              <w:t>0.818</w:t>
+            </w:r>
           </w:p>
         </w:tc>
       </w:tr>
@@ -4555,7 +4552,79 @@
     </w:p>
     <w:p>
       <w:r>
-        <w:t>Observação sobre variância: o conjunto de teste foi varrido por inteiro e, portanto, a maioria dos tiles é de fundo, sem o alvo. Isso, somado ao número limitado de instâncias, aumenta a variância das métricas, que devem ser lidas com cautela. Foi justamente para ter uma medida estável de generalização que a Avenida Paulista foi reservada como bairro inédito.</w:t>
+        <w:t>Na avaliação final, o YOLO11n apresentou desempenho superior ao YOLO26n no conjunto</w:t>
+      </w:r>
+      <w:r>
+        <w:t xml:space="preserve"> </w:t>
+      </w:r>
+      <w:r>
+        <w:t>de teste: precisão de 0,869 contra 0,710 e mAP@0.5 de 0,781 contra 0,709, com</w:t>
+      </w:r>
+      <w:r>
+        <w:t xml:space="preserve"> </w:t>
+      </w:r>
+      <w:r>
+        <w:t>revocação praticamente igual (0,818 contra 0,817) e mAP@0.5:0.95 equivalente (0,536</w:t>
+      </w:r>
+      <w:r>
+        <w:t xml:space="preserve"> </w:t>
+      </w:r>
+      <w:r>
+        <w:t>contra 0,530). Cabe registrar que, em versões anteriores do conjunto de dados, a</w:t>
+      </w:r>
+      <w:r>
+        <w:t xml:space="preserve"> </w:t>
+      </w:r>
+      <w:r>
+        <w:t>ordem entre os dois modelos se invertia, com o YOLO26n à frente. Essa alternância é</w:t>
+      </w:r>
+      <w:r>
+        <w:t xml:space="preserve"> </w:t>
+      </w:r>
+      <w:r>
+        <w:t>coerente com a alta variância de um conjunto de teste com apenas 33 instâncias, em</w:t>
+      </w:r>
+      <w:r>
+        <w:t xml:space="preserve"> </w:t>
+      </w:r>
+      <w:r>
+        <w:t>que diferenças de poucos pontos de mAP não são estatisticamente significativas.</w:t>
+      </w:r>
+    </w:p>
+    <w:p>
+      <w:r>
+        <w:t>Mantive o YOLO26n como modelo principal por ter sido a escolha de projeto a priori e</w:t>
+      </w:r>
+      <w:r>
+        <w:t xml:space="preserve"> </w:t>
+      </w:r>
+      <w:r>
+        <w:t>por suas melhorias voltadas a objetos pequenos, mas, para este problema e com este</w:t>
+      </w:r>
+      <w:r>
+        <w:t xml:space="preserve"> </w:t>
+      </w:r>
+      <w:r>
+        <w:t>volume de dados, os dois modelos nano devem ser considerados equivalentes.</w:t>
+      </w:r>
+    </w:p>
+    <w:p>
+      <w:r>
+        <w:t>O conjunto de teste foi varrido por inteiro, então a maioria dos tiles é de fundo,</w:t>
+      </w:r>
+    </w:p>
+    <w:p>
+      <w:r>
+        <w:t>sem o alvo. Isso, somado ao número limitado de instâncias, aumenta a variância das</w:t>
+      </w:r>
+      <w:r>
+        <w:t xml:space="preserve"> </w:t>
+      </w:r>
+      <w:r>
+        <w:t>métricas, que devem ser lidas com cautela</w:t>
+      </w:r>
+      <w:r>
+        <w:t>.</w:t>
       </w:r>
     </w:p>
     <w:p/>
@@ -4567,7 +4636,7 @@
           <w:numId w:val="4"/>
         </w:numPr>
       </w:pPr>
-      <w:bookmarkStart w:id="9" w:name="_Toc232830947"/>
+      <w:bookmarkStart w:id="9" w:name="_Toc233160076"/>
       <w:r>
         <w:t>CURVAS DE TREINO</w:t>
       </w:r>
@@ -4578,15 +4647,6 @@
         <w:t>As curvas abaixo, geradas a partir do histórico de treino da melhor rodada, mostram a evolução por época. A mAP (validação) cresce e estabiliza conforme o modelo aprende, enquanto as perdas de treino e validação decrescem; a distância entre as duas curvas de perda indica o nível de overfitting.</w:t>
       </w:r>
     </w:p>
-    <w:p/>
-    <w:p/>
-    <w:p/>
-    <w:p/>
-    <w:p/>
-    <w:p/>
-    <w:p/>
-    <w:p/>
-    <w:p/>
     <w:p>
       <w:pPr>
         <w:ind w:firstLine="0"/>
@@ -4601,19 +4661,125 @@
           <w:noProof/>
         </w:rPr>
         <w:lastRenderedPageBreak/>
+        <w:drawing>
+          <wp:inline distT="0" distB="0" distL="0" distR="0" wp14:anchorId="415E1B60" wp14:editId="2B528A96">
+            <wp:extent cx="5760085" cy="3919855"/>
+            <wp:effectExtent l="0" t="0" r="0" b="4445"/>
+            <wp:docPr id="1750858307" name="Picture 10"/>
+            <wp:cNvGraphicFramePr>
+              <a:graphicFrameLocks xmlns:a="http://schemas.openxmlformats.org/drawingml/2006/main" noChangeAspect="1"/>
+            </wp:cNvGraphicFramePr>
+            <a:graphic xmlns:a="http://schemas.openxmlformats.org/drawingml/2006/main">
+              <a:graphicData uri="http://schemas.openxmlformats.org/drawingml/2006/picture">
+                <pic:pic xmlns:pic="http://schemas.openxmlformats.org/drawingml/2006/picture">
+                  <pic:nvPicPr>
+                    <pic:cNvPr id="0" name="Picture 2"/>
+                    <pic:cNvPicPr>
+                      <a:picLocks noChangeAspect="1" noChangeArrowheads="1"/>
+                    </pic:cNvPicPr>
+                  </pic:nvPicPr>
+                  <pic:blipFill>
+                    <a:blip r:embed="rId17">
+                      <a:extLst>
+                        <a:ext uri="{28A0092B-C50C-407E-A947-70E740481C1C}">
+                          <a14:useLocalDpi xmlns:a14="http://schemas.microsoft.com/office/drawing/2010/main" val="0"/>
+                        </a:ext>
+                      </a:extLst>
+                    </a:blip>
+                    <a:srcRect/>
+                    <a:stretch>
+                      <a:fillRect/>
+                    </a:stretch>
+                  </pic:blipFill>
+                  <pic:spPr bwMode="auto">
+                    <a:xfrm>
+                      <a:off x="0" y="0"/>
+                      <a:ext cx="5760085" cy="3919855"/>
+                    </a:xfrm>
+                    <a:prstGeom prst="rect">
+                      <a:avLst/>
+                    </a:prstGeom>
+                    <a:noFill/>
+                    <a:ln>
+                      <a:noFill/>
+                    </a:ln>
+                  </pic:spPr>
+                </pic:pic>
+              </a:graphicData>
+            </a:graphic>
+          </wp:inline>
+        </w:drawing>
+      </w:r>
+      <w:r>
+        <w:rPr>
+          <w:noProof/>
+        </w:rPr>
+        <w:drawing>
+          <wp:inline distT="0" distB="0" distL="0" distR="0" wp14:anchorId="524D1634" wp14:editId="7CC0A1A9">
+            <wp:extent cx="5760085" cy="3847465"/>
+            <wp:effectExtent l="0" t="0" r="0" b="635"/>
+            <wp:docPr id="2012308261" name="Picture 9"/>
+            <wp:cNvGraphicFramePr>
+              <a:graphicFrameLocks xmlns:a="http://schemas.openxmlformats.org/drawingml/2006/main" noChangeAspect="1"/>
+            </wp:cNvGraphicFramePr>
+            <a:graphic xmlns:a="http://schemas.openxmlformats.org/drawingml/2006/main">
+              <a:graphicData uri="http://schemas.openxmlformats.org/drawingml/2006/picture">
+                <pic:pic xmlns:pic="http://schemas.openxmlformats.org/drawingml/2006/picture">
+                  <pic:nvPicPr>
+                    <pic:cNvPr id="0" name="Picture 1"/>
+                    <pic:cNvPicPr>
+                      <a:picLocks noChangeAspect="1" noChangeArrowheads="1"/>
+                    </pic:cNvPicPr>
+                  </pic:nvPicPr>
+                  <pic:blipFill>
+                    <a:blip r:embed="rId18">
+                      <a:extLst>
+                        <a:ext uri="{28A0092B-C50C-407E-A947-70E740481C1C}">
+                          <a14:useLocalDpi xmlns:a14="http://schemas.microsoft.com/office/drawing/2010/main" val="0"/>
+                        </a:ext>
+                      </a:extLst>
+                    </a:blip>
+                    <a:srcRect/>
+                    <a:stretch>
+                      <a:fillRect/>
+                    </a:stretch>
+                  </pic:blipFill>
+                  <pic:spPr bwMode="auto">
+                    <a:xfrm>
+                      <a:off x="0" y="0"/>
+                      <a:ext cx="5760085" cy="3847465"/>
+                    </a:xfrm>
+                    <a:prstGeom prst="rect">
+                      <a:avLst/>
+                    </a:prstGeom>
+                    <a:noFill/>
+                    <a:ln>
+                      <a:noFill/>
+                    </a:ln>
+                  </pic:spPr>
+                </pic:pic>
+              </a:graphicData>
+            </a:graphic>
+          </wp:inline>
+        </w:drawing>
+      </w:r>
+      <w:r>
+        <w:rPr>
+          <w:noProof/>
+        </w:rPr>
         <mc:AlternateContent>
           <mc:Choice Requires="wps">
             <w:drawing>
-              <wp:anchor distT="0" distB="0" distL="114300" distR="114300" simplePos="0" relativeHeight="251674624" behindDoc="0" locked="0" layoutInCell="1" allowOverlap="1" wp14:anchorId="00919A52" wp14:editId="425E45DB">
+              <wp:anchor distT="0" distB="0" distL="114300" distR="114300" simplePos="0" relativeHeight="251682816" behindDoc="0" locked="0" layoutInCell="1" allowOverlap="1" wp14:anchorId="16365044" wp14:editId="3CB1EB1D">
                 <wp:simplePos x="0" y="0"/>
-                <wp:positionH relativeFrom="column">
+                <wp:positionH relativeFrom="margin">
                   <wp:posOffset>0</wp:posOffset>
                 </wp:positionH>
                 <wp:positionV relativeFrom="paragraph">
-                  <wp:posOffset>4000500</wp:posOffset>
+                  <wp:posOffset>7939405</wp:posOffset>
                 </wp:positionV>
                 <wp:extent cx="5762625" cy="635"/>
-                <wp:effectExtent l="0" t="0" r="0" b="0"/>
+                <wp:effectExtent l="0" t="0" r="9525" b="9525"/>
                 <wp:wrapSquare wrapText="bothSides"/>
                 <wp:docPr id="39490315" name="Text Box 1"/>
                 <wp:cNvGraphicFramePr/>
@@ -4653,7 +4819,21 @@
                                 <w:sz w:val="20"/>
                                 <w:szCs w:val="20"/>
                               </w:rPr>
-                              <w:t xml:space="preserve">Figura </w:t>
+                              <w:t>Figura</w:t>
+                            </w:r>
+                            <w:r>
+                              <w:rPr>
+                                <w:sz w:val="20"/>
+                                <w:szCs w:val="20"/>
+                              </w:rPr>
+                              <w:t>s</w:t>
+                            </w:r>
+                            <w:r>
+                              <w:rPr>
+                                <w:sz w:val="20"/>
+                                <w:szCs w:val="20"/>
+                              </w:rPr>
+                              <w:t xml:space="preserve"> </w:t>
                             </w:r>
                             <w:r>
                               <w:rPr>
@@ -4696,7 +4876,28 @@
                                 <w:sz w:val="20"/>
                                 <w:szCs w:val="20"/>
                               </w:rPr>
-                              <w:t xml:space="preserve"> - Gráfico de Loss por Época</w:t>
+                              <w:t xml:space="preserve"> e 6</w:t>
+                            </w:r>
+                            <w:r>
+                              <w:rPr>
+                                <w:sz w:val="20"/>
+                                <w:szCs w:val="20"/>
+                              </w:rPr>
+                              <w:t xml:space="preserve"> - Gráfico</w:t>
+                            </w:r>
+                            <w:r>
+                              <w:rPr>
+                                <w:sz w:val="20"/>
+                                <w:szCs w:val="20"/>
+                              </w:rPr>
+                              <w:t>s</w:t>
+                            </w:r>
+                            <w:r>
+                              <w:rPr>
+                                <w:sz w:val="20"/>
+                                <w:szCs w:val="20"/>
+                              </w:rPr>
+                              <w:t xml:space="preserve"> de Loss por Época</w:t>
                             </w:r>
                           </w:p>
                         </w:txbxContent>
@@ -4715,7 +4916,11 @@
           </mc:Choice>
           <mc:Fallback>
             <w:pict>
-              <v:shape w14:anchorId="00919A52" id="_x0000_s1030" type="#_x0000_t202" style="position:absolute;left:0;text-align:left;margin-left:0;margin-top:315pt;width:453.75pt;height:.05pt;z-index:251674624;visibility:visible;mso-wrap-style:square;mso-wrap-distance-left:9pt;mso-wrap-distance-top:0;mso-wrap-distance-right:9pt;mso-wrap-distance-bottom:0;mso-position-horizontal:absolute;mso-position-horizontal-relative:text;mso-position-vertical:absolute;mso-position-vertical-relative:text;v-text-anchor:top" o:gfxdata="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" stroked="f">
+              <v:shapetype w14:anchorId="16365044" id="_x0000_t202" coordsize="21600,21600" o:spt="202" path="m,l,21600r21600,l21600,xe">
+                <v:stroke joinstyle="miter"/>
+                <v:path gradientshapeok="t" o:connecttype="rect"/>
+              </v:shapetype>
+              <v:shape id="_x0000_s1030" type="#_x0000_t202" style="position:absolute;left:0;text-align:left;margin-left:0;margin-top:625.15pt;width:453.75pt;height:.05pt;z-index:251682816;visibility:visible;mso-wrap-style:square;mso-wrap-distance-left:9pt;mso-wrap-distance-top:0;mso-wrap-distance-right:9pt;mso-wrap-distance-bottom:0;mso-position-horizontal:absolute;mso-position-horizontal-relative:margin;mso-position-vertical:absolute;mso-position-vertical-relative:text;v-text-anchor:top" o:gfxdata="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" stroked="f">
                 <v:textbox style="mso-fit-shape-to-text:t" inset="0,0,0,0">
                   <w:txbxContent>
                     <w:p>
@@ -4733,7 +4938,21 @@
                           <w:sz w:val="20"/>
                           <w:szCs w:val="20"/>
                         </w:rPr>
-                        <w:t xml:space="preserve">Figura </w:t>
+                        <w:t>Figura</w:t>
+                      </w:r>
+                      <w:r>
+                        <w:rPr>
+                          <w:sz w:val="20"/>
+                          <w:szCs w:val="20"/>
+                        </w:rPr>
+                        <w:t>s</w:t>
+                      </w:r>
+                      <w:r>
+                        <w:rPr>
+                          <w:sz w:val="20"/>
+                          <w:szCs w:val="20"/>
+                        </w:rPr>
+                        <w:t xml:space="preserve"> </w:t>
                       </w:r>
                       <w:r>
                         <w:rPr>
@@ -4776,77 +4995,38 @@
                           <w:sz w:val="20"/>
                           <w:szCs w:val="20"/>
                         </w:rPr>
-                        <w:t xml:space="preserve"> - Gráfico de Loss por Época</w:t>
+                        <w:t xml:space="preserve"> e 6</w:t>
+                      </w:r>
+                      <w:r>
+                        <w:rPr>
+                          <w:sz w:val="20"/>
+                          <w:szCs w:val="20"/>
+                        </w:rPr>
+                        <w:t xml:space="preserve"> - Gráfico</w:t>
+                      </w:r>
+                      <w:r>
+                        <w:rPr>
+                          <w:sz w:val="20"/>
+                          <w:szCs w:val="20"/>
+                        </w:rPr>
+                        <w:t>s</w:t>
+                      </w:r>
+                      <w:r>
+                        <w:rPr>
+                          <w:sz w:val="20"/>
+                          <w:szCs w:val="20"/>
+                        </w:rPr>
+                        <w:t xml:space="preserve"> de Loss por Época</w:t>
                       </w:r>
                     </w:p>
                   </w:txbxContent>
                 </v:textbox>
-                <w10:wrap type="square"/>
+                <w10:wrap type="square" anchorx="margin"/>
               </v:shape>
             </w:pict>
           </mc:Fallback>
         </mc:AlternateContent>
       </w:r>
-      <w:r>
-        <w:rPr>
-          <w:noProof/>
-        </w:rPr>
-        <w:drawing>
-          <wp:anchor distT="0" distB="0" distL="114300" distR="114300" simplePos="0" relativeHeight="251654144" behindDoc="0" locked="0" layoutInCell="1" allowOverlap="1" wp14:anchorId="525B8309" wp14:editId="477B0588">
-            <wp:simplePos x="0" y="0"/>
-            <wp:positionH relativeFrom="column">
-              <wp:align>left</wp:align>
-            </wp:positionH>
-            <wp:positionV relativeFrom="paragraph">
-              <wp:posOffset>0</wp:posOffset>
-            </wp:positionV>
-            <wp:extent cx="5762625" cy="3943350"/>
-            <wp:effectExtent l="0" t="0" r="0" b="0"/>
-            <wp:wrapSquare wrapText="bothSides"/>
-            <wp:docPr id="284352413" name="drawing"/>
-            <wp:cNvGraphicFramePr>
-              <a:graphicFrameLocks xmlns:a="http://schemas.openxmlformats.org/drawingml/2006/main" noChangeAspect="1"/>
-            </wp:cNvGraphicFramePr>
-            <a:graphic xmlns:a="http://schemas.openxmlformats.org/drawingml/2006/main">
-              <a:graphicData uri="http://schemas.openxmlformats.org/drawingml/2006/picture">
-                <pic:pic xmlns:pic="http://schemas.openxmlformats.org/drawingml/2006/picture">
-                  <pic:nvPicPr>
-                    <pic:cNvPr id="284352413" name="Picture 284352413"/>
-                    <pic:cNvPicPr/>
-                  </pic:nvPicPr>
-                  <pic:blipFill>
-                    <a:blip r:embed="rId17">
-                      <a:extLst>
-                        <a:ext uri="{28A0092B-C50C-407E-A947-70E740481C1C}">
-                          <a14:useLocalDpi xmlns:a14="http://schemas.microsoft.com/office/drawing/2010/main"/>
-                        </a:ext>
-                      </a:extLst>
-                    </a:blip>
-                    <a:stretch>
-                      <a:fillRect/>
-                    </a:stretch>
-                  </pic:blipFill>
-                  <pic:spPr>
-                    <a:xfrm>
-                      <a:off x="0" y="0"/>
-                      <a:ext cx="5762625" cy="3943350"/>
-                    </a:xfrm>
-                    <a:prstGeom prst="rect">
-                      <a:avLst/>
-                    </a:prstGeom>
-                  </pic:spPr>
-                </pic:pic>
-              </a:graphicData>
-            </a:graphic>
-            <wp14:sizeRelH relativeFrom="page">
-              <wp14:pctWidth>0</wp14:pctWidth>
-            </wp14:sizeRelH>
-            <wp14:sizeRelV relativeFrom="page">
-              <wp14:pctHeight>0</wp14:pctHeight>
-            </wp14:sizeRelV>
-          </wp:anchor>
-        </w:drawing>
-      </w:r>
     </w:p>
     <w:p>
       <w:pPr>
@@ -4862,19 +5042,20 @@
         <w:rPr>
           <w:noProof/>
         </w:rPr>
+        <w:lastRenderedPageBreak/>
         <mc:AlternateContent>
           <mc:Choice Requires="wps">
             <w:drawing>
-              <wp:anchor distT="0" distB="0" distL="114300" distR="114300" simplePos="0" relativeHeight="251676672" behindDoc="0" locked="0" layoutInCell="1" allowOverlap="1" wp14:anchorId="24BE5A91" wp14:editId="4827E560">
+              <wp:anchor distT="0" distB="0" distL="114300" distR="114300" simplePos="0" relativeHeight="251676672" behindDoc="0" locked="0" layoutInCell="1" allowOverlap="1" wp14:anchorId="24BE5A91" wp14:editId="2202F209">
                 <wp:simplePos x="0" y="0"/>
-                <wp:positionH relativeFrom="column">
-                  <wp:posOffset>0</wp:posOffset>
+                <wp:positionH relativeFrom="margin">
+                  <wp:align>left</wp:align>
                 </wp:positionH>
                 <wp:positionV relativeFrom="paragraph">
-                  <wp:posOffset>8625840</wp:posOffset>
+                  <wp:posOffset>8069249</wp:posOffset>
                 </wp:positionV>
                 <wp:extent cx="5762625" cy="635"/>
-                <wp:effectExtent l="0" t="0" r="0" b="0"/>
+                <wp:effectExtent l="0" t="0" r="9525" b="9525"/>
                 <wp:wrapSquare wrapText="bothSides"/>
                 <wp:docPr id="1989107105" name="Text Box 1"/>
                 <wp:cNvGraphicFramePr/>
@@ -4914,50 +5095,49 @@
                                 <w:sz w:val="20"/>
                                 <w:szCs w:val="20"/>
                               </w:rPr>
-                              <w:t xml:space="preserve">Figura </w:t>
+                              <w:t>Figura</w:t>
                             </w:r>
                             <w:r>
                               <w:rPr>
                                 <w:sz w:val="20"/>
                                 <w:szCs w:val="20"/>
                               </w:rPr>
-                              <w:fldChar w:fldCharType="begin"/>
+                              <w:t>s</w:t>
                             </w:r>
                             <w:r>
                               <w:rPr>
                                 <w:sz w:val="20"/>
                                 <w:szCs w:val="20"/>
                               </w:rPr>
-                              <w:instrText xml:space="preserve"> SEQ Figura \* ARABIC </w:instrText>
+                              <w:t xml:space="preserve"> </w:t>
                             </w:r>
                             <w:r>
                               <w:rPr>
                                 <w:sz w:val="20"/>
                                 <w:szCs w:val="20"/>
                               </w:rPr>
-                              <w:fldChar w:fldCharType="separate"/>
-                            </w:r>
-                            <w:r>
-                              <w:rPr>
-                                <w:noProof/>
-                                <w:sz w:val="20"/>
-                                <w:szCs w:val="20"/>
-                              </w:rPr>
-                              <w:t>6</w:t>
+                              <w:t>7 e 8</w:t>
                             </w:r>
                             <w:r>
                               <w:rPr>
                                 <w:sz w:val="20"/>
                                 <w:szCs w:val="20"/>
                               </w:rPr>
-                              <w:fldChar w:fldCharType="end"/>
+                              <w:t xml:space="preserve"> - Gráfico</w:t>
                             </w:r>
                             <w:r>
                               <w:rPr>
                                 <w:sz w:val="20"/>
                                 <w:szCs w:val="20"/>
                               </w:rPr>
-                              <w:t xml:space="preserve"> - Gráfico da métrica mAP por época</w:t>
+                              <w:t>s</w:t>
+                            </w:r>
+                            <w:r>
+                              <w:rPr>
+                                <w:sz w:val="20"/>
+                                <w:szCs w:val="20"/>
+                              </w:rPr>
+                              <w:t xml:space="preserve"> da métrica mAP por época</w:t>
                             </w:r>
                           </w:p>
                         </w:txbxContent>
@@ -4976,7 +5156,7 @@
           </mc:Choice>
           <mc:Fallback>
             <w:pict>
-              <v:shape w14:anchorId="24BE5A91" id="_x0000_s1031" type="#_x0000_t202" style="position:absolute;left:0;text-align:left;margin-left:0;margin-top:679.2pt;width:453.75pt;height:.05pt;z-index:251676672;visibility:visible;mso-wrap-style:square;mso-wrap-distance-left:9pt;mso-wrap-distance-top:0;mso-wrap-distance-right:9pt;mso-wrap-distance-bottom:0;mso-position-horizontal:absolute;mso-position-horizontal-relative:text;mso-position-vertical:absolute;mso-position-vertical-relative:text;v-text-anchor:top" o:gfxdata="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" stroked="f">
+              <v:shape w14:anchorId="24BE5A91" id="_x0000_s1031" type="#_x0000_t202" style="position:absolute;left:0;text-align:left;margin-left:0;margin-top:635.35pt;width:453.75pt;height:.05pt;z-index:251676672;visibility:visible;mso-wrap-style:square;mso-wrap-distance-left:9pt;mso-wrap-distance-top:0;mso-wrap-distance-right:9pt;mso-wrap-distance-bottom:0;mso-position-horizontal:left;mso-position-horizontal-relative:margin;mso-position-vertical:absolute;mso-position-vertical-relative:text;v-text-anchor:top" o:gfxdata="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" stroked="f">
                 <v:textbox style="mso-fit-shape-to-text:t" inset="0,0,0,0">
                   <w:txbxContent>
                     <w:p>
@@ -4994,55 +5174,54 @@
                           <w:sz w:val="20"/>
                           <w:szCs w:val="20"/>
                         </w:rPr>
-                        <w:t xml:space="preserve">Figura </w:t>
+                        <w:t>Figura</w:t>
                       </w:r>
                       <w:r>
                         <w:rPr>
                           <w:sz w:val="20"/>
                           <w:szCs w:val="20"/>
                         </w:rPr>
-                        <w:fldChar w:fldCharType="begin"/>
+                        <w:t>s</w:t>
                       </w:r>
                       <w:r>
                         <w:rPr>
                           <w:sz w:val="20"/>
                           <w:szCs w:val="20"/>
                         </w:rPr>
-                        <w:instrText xml:space="preserve"> SEQ Figura \* ARABIC </w:instrText>
+                        <w:t xml:space="preserve"> </w:t>
                       </w:r>
                       <w:r>
                         <w:rPr>
                           <w:sz w:val="20"/>
                           <w:szCs w:val="20"/>
                         </w:rPr>
-                        <w:fldChar w:fldCharType="separate"/>
-                      </w:r>
-                      <w:r>
-                        <w:rPr>
-                          <w:noProof/>
-                          <w:sz w:val="20"/>
-                          <w:szCs w:val="20"/>
-                        </w:rPr>
-                        <w:t>6</w:t>
+                        <w:t>7 e 8</w:t>
                       </w:r>
                       <w:r>
                         <w:rPr>
                           <w:sz w:val="20"/>
                           <w:szCs w:val="20"/>
                         </w:rPr>
-                        <w:fldChar w:fldCharType="end"/>
+                        <w:t xml:space="preserve"> - Gráfico</w:t>
                       </w:r>
                       <w:r>
                         <w:rPr>
                           <w:sz w:val="20"/>
                           <w:szCs w:val="20"/>
                         </w:rPr>
-                        <w:t xml:space="preserve"> - Gráfico da métrica mAP por época</w:t>
+                        <w:t>s</w:t>
+                      </w:r>
+                      <w:r>
+                        <w:rPr>
+                          <w:sz w:val="20"/>
+                          <w:szCs w:val="20"/>
+                        </w:rPr>
+                        <w:t xml:space="preserve"> da métrica mAP por época</w:t>
                       </w:r>
                     </w:p>
                   </w:txbxContent>
                 </v:textbox>
-                <w10:wrap type="square"/>
+                <w10:wrap type="square" anchorx="margin"/>
               </v:shape>
             </w:pict>
           </mc:Fallback>
@@ -5053,18 +5232,10 @@
           <w:noProof/>
         </w:rPr>
         <w:drawing>
-          <wp:anchor distT="0" distB="0" distL="114300" distR="114300" simplePos="0" relativeHeight="251656192" behindDoc="0" locked="0" layoutInCell="1" allowOverlap="1" wp14:anchorId="39C05ABC" wp14:editId="18EFD427">
-            <wp:simplePos x="0" y="0"/>
-            <wp:positionH relativeFrom="column">
-              <wp:align>left</wp:align>
-            </wp:positionH>
-            <wp:positionV relativeFrom="paragraph">
-              <wp:posOffset>0</wp:posOffset>
-            </wp:positionV>
-            <wp:extent cx="5762625" cy="3924300"/>
-            <wp:effectExtent l="0" t="0" r="0" b="0"/>
-            <wp:wrapSquare wrapText="bothSides"/>
-            <wp:docPr id="869268812" name="drawing"/>
+          <wp:inline distT="0" distB="0" distL="0" distR="0" wp14:anchorId="790EC4C4" wp14:editId="6C4A4446">
+            <wp:extent cx="5760085" cy="3895725"/>
+            <wp:effectExtent l="0" t="0" r="0" b="9525"/>
+            <wp:docPr id="1147612898" name="Picture 11"/>
             <wp:cNvGraphicFramePr>
               <a:graphicFrameLocks xmlns:a="http://schemas.openxmlformats.org/drawingml/2006/main" noChangeAspect="1"/>
             </wp:cNvGraphicFramePr>
@@ -5072,11 +5243,451 @@
               <a:graphicData uri="http://schemas.openxmlformats.org/drawingml/2006/picture">
                 <pic:pic xmlns:pic="http://schemas.openxmlformats.org/drawingml/2006/picture">
                   <pic:nvPicPr>
-                    <pic:cNvPr id="805470320" name="Picture 805470320"/>
+                    <pic:cNvPr id="0" name="Picture 5"/>
+                    <pic:cNvPicPr>
+                      <a:picLocks noChangeAspect="1" noChangeArrowheads="1"/>
+                    </pic:cNvPicPr>
+                  </pic:nvPicPr>
+                  <pic:blipFill>
+                    <a:blip r:embed="rId19">
+                      <a:extLst>
+                        <a:ext uri="{28A0092B-C50C-407E-A947-70E740481C1C}">
+                          <a14:useLocalDpi xmlns:a14="http://schemas.microsoft.com/office/drawing/2010/main" val="0"/>
+                        </a:ext>
+                      </a:extLst>
+                    </a:blip>
+                    <a:srcRect/>
+                    <a:stretch>
+                      <a:fillRect/>
+                    </a:stretch>
+                  </pic:blipFill>
+                  <pic:spPr bwMode="auto">
+                    <a:xfrm>
+                      <a:off x="0" y="0"/>
+                      <a:ext cx="5760085" cy="3895725"/>
+                    </a:xfrm>
+                    <a:prstGeom prst="rect">
+                      <a:avLst/>
+                    </a:prstGeom>
+                    <a:noFill/>
+                    <a:ln>
+                      <a:noFill/>
+                    </a:ln>
+                  </pic:spPr>
+                </pic:pic>
+              </a:graphicData>
+            </a:graphic>
+          </wp:inline>
+        </w:drawing>
+      </w:r>
+      <w:r>
+        <w:rPr>
+          <w:noProof/>
+        </w:rPr>
+        <w:drawing>
+          <wp:inline distT="0" distB="0" distL="0" distR="0" wp14:anchorId="0907204F" wp14:editId="121A2C35">
+            <wp:extent cx="5760085" cy="3895725"/>
+            <wp:effectExtent l="0" t="0" r="0" b="9525"/>
+            <wp:docPr id="1967674701" name="Picture 12"/>
+            <wp:cNvGraphicFramePr>
+              <a:graphicFrameLocks xmlns:a="http://schemas.openxmlformats.org/drawingml/2006/main" noChangeAspect="1"/>
+            </wp:cNvGraphicFramePr>
+            <a:graphic xmlns:a="http://schemas.openxmlformats.org/drawingml/2006/main">
+              <a:graphicData uri="http://schemas.openxmlformats.org/drawingml/2006/picture">
+                <pic:pic xmlns:pic="http://schemas.openxmlformats.org/drawingml/2006/picture">
+                  <pic:nvPicPr>
+                    <pic:cNvPr id="0" name="Picture 6"/>
+                    <pic:cNvPicPr>
+                      <a:picLocks noChangeAspect="1" noChangeArrowheads="1"/>
+                    </pic:cNvPicPr>
+                  </pic:nvPicPr>
+                  <pic:blipFill>
+                    <a:blip r:embed="rId20">
+                      <a:extLst>
+                        <a:ext uri="{28A0092B-C50C-407E-A947-70E740481C1C}">
+                          <a14:useLocalDpi xmlns:a14="http://schemas.microsoft.com/office/drawing/2010/main" val="0"/>
+                        </a:ext>
+                      </a:extLst>
+                    </a:blip>
+                    <a:srcRect/>
+                    <a:stretch>
+                      <a:fillRect/>
+                    </a:stretch>
+                  </pic:blipFill>
+                  <pic:spPr bwMode="auto">
+                    <a:xfrm>
+                      <a:off x="0" y="0"/>
+                      <a:ext cx="5760085" cy="3895725"/>
+                    </a:xfrm>
+                    <a:prstGeom prst="rect">
+                      <a:avLst/>
+                    </a:prstGeom>
+                    <a:noFill/>
+                    <a:ln>
+                      <a:noFill/>
+                    </a:ln>
+                  </pic:spPr>
+                </pic:pic>
+              </a:graphicData>
+            </a:graphic>
+          </wp:inline>
+        </w:drawing>
+      </w:r>
+    </w:p>
+    <w:p>
+      <w:pPr>
+        <w:ind w:firstLine="0"/>
+        <w:jc w:val="center"/>
+        <w:rPr>
+          <w:rFonts w:eastAsia="Arial" w:cs="Arial"/>
+          <w:sz w:val="20"/>
+          <w:szCs w:val="20"/>
+        </w:rPr>
+      </w:pPr>
+    </w:p>
+    <w:p>
+      <w:pPr>
+        <w:ind w:firstLine="0"/>
+        <w:jc w:val="center"/>
+        <w:rPr>
+          <w:rFonts w:eastAsia="Arial" w:cs="Arial"/>
+          <w:sz w:val="20"/>
+          <w:szCs w:val="20"/>
+        </w:rPr>
+      </w:pPr>
+    </w:p>
+    <w:p>
+      <w:pPr>
+        <w:pStyle w:val="ListParagraph"/>
+        <w:numPr>
+          <w:ilvl w:val="1"/>
+          <w:numId w:val="4"/>
+        </w:numPr>
+        <w:rPr>
+          <w:rFonts w:ascii="Arial" w:eastAsia="Arial" w:hAnsi="Arial" w:cs="Arial"/>
+          <w:b/>
+          <w:bCs/>
+          <w:sz w:val="24"/>
+          <w:szCs w:val="24"/>
+        </w:rPr>
+      </w:pPr>
+      <w:r>
+        <w:rPr>
+          <w:rFonts w:ascii="Arial" w:eastAsia="Arial" w:hAnsi="Arial" w:cs="Arial"/>
+          <w:b/>
+          <w:bCs/>
+          <w:sz w:val="24"/>
+          <w:szCs w:val="24"/>
+        </w:rPr>
+        <w:lastRenderedPageBreak/>
+        <w:t>ANÁLISE DE ERROS</w:t>
+      </w:r>
+    </w:p>
+    <w:p>
+      <w:r>
+        <w:t>Casando as detecções (confiança &gt;= 0,25) com as anotações verdadeiras por IoU &gt;= 0,50, coletei exemplos representativos do comportamento do modelo no teste. A matriz de confusão, no ponto de confiança 0,25, registrou</w:t>
+      </w:r>
+      <w:r>
+        <w:t>:</w:t>
+      </w:r>
+    </w:p>
+    <w:p>
+      <w:r>
+        <w:rPr>
+          <w:noProof/>
+        </w:rPr>
+        <w:drawing>
+          <wp:inline distT="0" distB="0" distL="0" distR="0" wp14:anchorId="4E99A5E3" wp14:editId="777DCEED">
+            <wp:extent cx="4882101" cy="3661441"/>
+            <wp:effectExtent l="0" t="0" r="0" b="0"/>
+            <wp:docPr id="406988995" name="Picture 13"/>
+            <wp:cNvGraphicFramePr>
+              <a:graphicFrameLocks xmlns:a="http://schemas.openxmlformats.org/drawingml/2006/main" noChangeAspect="1"/>
+            </wp:cNvGraphicFramePr>
+            <a:graphic xmlns:a="http://schemas.openxmlformats.org/drawingml/2006/main">
+              <a:graphicData uri="http://schemas.openxmlformats.org/drawingml/2006/picture">
+                <pic:pic xmlns:pic="http://schemas.openxmlformats.org/drawingml/2006/picture">
+                  <pic:nvPicPr>
+                    <pic:cNvPr id="0" name="Picture 9"/>
+                    <pic:cNvPicPr>
+                      <a:picLocks noChangeAspect="1" noChangeArrowheads="1"/>
+                    </pic:cNvPicPr>
+                  </pic:nvPicPr>
+                  <pic:blipFill>
+                    <a:blip r:embed="rId21" cstate="print">
+                      <a:extLst>
+                        <a:ext uri="{28A0092B-C50C-407E-A947-70E740481C1C}">
+                          <a14:useLocalDpi xmlns:a14="http://schemas.microsoft.com/office/drawing/2010/main" val="0"/>
+                        </a:ext>
+                      </a:extLst>
+                    </a:blip>
+                    <a:srcRect/>
+                    <a:stretch>
+                      <a:fillRect/>
+                    </a:stretch>
+                  </pic:blipFill>
+                  <pic:spPr bwMode="auto">
+                    <a:xfrm>
+                      <a:off x="0" y="0"/>
+                      <a:ext cx="4886916" cy="3665052"/>
+                    </a:xfrm>
+                    <a:prstGeom prst="rect">
+                      <a:avLst/>
+                    </a:prstGeom>
+                    <a:noFill/>
+                    <a:ln>
+                      <a:noFill/>
+                    </a:ln>
+                  </pic:spPr>
+                </pic:pic>
+              </a:graphicData>
+            </a:graphic>
+          </wp:inline>
+        </w:drawing>
+      </w:r>
+      <w:r>
+        <w:rPr>
+          <w:noProof/>
+        </w:rPr>
+        <w:drawing>
+          <wp:inline distT="0" distB="0" distL="0" distR="0" wp14:anchorId="7EF0D45E" wp14:editId="363936A5">
+            <wp:extent cx="4548147" cy="3410984"/>
+            <wp:effectExtent l="0" t="0" r="5080" b="0"/>
+            <wp:docPr id="1092046210" name="Picture 14"/>
+            <wp:cNvGraphicFramePr>
+              <a:graphicFrameLocks xmlns:a="http://schemas.openxmlformats.org/drawingml/2006/main" noChangeAspect="1"/>
+            </wp:cNvGraphicFramePr>
+            <a:graphic xmlns:a="http://schemas.openxmlformats.org/drawingml/2006/main">
+              <a:graphicData uri="http://schemas.openxmlformats.org/drawingml/2006/picture">
+                <pic:pic xmlns:pic="http://schemas.openxmlformats.org/drawingml/2006/picture">
+                  <pic:nvPicPr>
+                    <pic:cNvPr id="0" name="Picture 10"/>
+                    <pic:cNvPicPr>
+                      <a:picLocks noChangeAspect="1" noChangeArrowheads="1"/>
+                    </pic:cNvPicPr>
+                  </pic:nvPicPr>
+                  <pic:blipFill>
+                    <a:blip r:embed="rId22" cstate="print">
+                      <a:extLst>
+                        <a:ext uri="{28A0092B-C50C-407E-A947-70E740481C1C}">
+                          <a14:useLocalDpi xmlns:a14="http://schemas.microsoft.com/office/drawing/2010/main" val="0"/>
+                        </a:ext>
+                      </a:extLst>
+                    </a:blip>
+                    <a:srcRect/>
+                    <a:stretch>
+                      <a:fillRect/>
+                    </a:stretch>
+                  </pic:blipFill>
+                  <pic:spPr bwMode="auto">
+                    <a:xfrm>
+                      <a:off x="0" y="0"/>
+                      <a:ext cx="4553333" cy="3414873"/>
+                    </a:xfrm>
+                    <a:prstGeom prst="rect">
+                      <a:avLst/>
+                    </a:prstGeom>
+                    <a:noFill/>
+                    <a:ln>
+                      <a:noFill/>
+                    </a:ln>
+                  </pic:spPr>
+                </pic:pic>
+              </a:graphicData>
+            </a:graphic>
+          </wp:inline>
+        </w:drawing>
+      </w:r>
+    </w:p>
+    <w:p>
+      <w:pPr>
+        <w:keepNext/>
+        <w:ind w:firstLine="0"/>
+        <w:jc w:val="center"/>
+      </w:pPr>
+    </w:p>
+    <w:p>
+      <w:pPr>
+        <w:pStyle w:val="Caption"/>
+        <w:rPr>
+          <w:sz w:val="20"/>
+          <w:szCs w:val="20"/>
+        </w:rPr>
+      </w:pPr>
+      <w:r>
+        <w:rPr>
+          <w:sz w:val="20"/>
+          <w:szCs w:val="20"/>
+        </w:rPr>
+        <w:t>Figura</w:t>
+      </w:r>
+      <w:r>
+        <w:rPr>
+          <w:sz w:val="20"/>
+          <w:szCs w:val="20"/>
+        </w:rPr>
+        <w:t>s 9 e 10</w:t>
+      </w:r>
+      <w:r>
+        <w:rPr>
+          <w:sz w:val="20"/>
+          <w:szCs w:val="20"/>
+        </w:rPr>
+        <w:t xml:space="preserve"> - Matriz</w:t>
+      </w:r>
+      <w:r>
+        <w:rPr>
+          <w:sz w:val="20"/>
+          <w:szCs w:val="20"/>
+        </w:rPr>
+        <w:t>es</w:t>
+      </w:r>
+      <w:r>
+        <w:rPr>
+          <w:sz w:val="20"/>
+          <w:szCs w:val="20"/>
+        </w:rPr>
+        <w:t xml:space="preserve"> de Confusão</w:t>
+      </w:r>
+      <w:r>
+        <w:rPr>
+          <w:sz w:val="20"/>
+          <w:szCs w:val="20"/>
+        </w:rPr>
+        <w:t>, 1° YOLO26 e 2° YOLO11</w:t>
+      </w:r>
+    </w:p>
+    <w:p>
+      <w:pPr>
+        <w:ind w:firstLine="0"/>
+        <w:jc w:val="center"/>
+        <w:rPr>
+          <w:rFonts w:eastAsia="Arial" w:cs="Arial"/>
+          <w:sz w:val="20"/>
+          <w:szCs w:val="20"/>
+        </w:rPr>
+      </w:pPr>
+      <w:r>
+        <w:rPr>
+          <w:rFonts w:eastAsia="Arial" w:cs="Arial"/>
+          <w:sz w:val="20"/>
+          <w:szCs w:val="20"/>
+        </w:rPr>
+        <w:lastRenderedPageBreak/>
+        <w:t xml:space="preserve"> </w:t>
+      </w:r>
+    </w:p>
+    <w:p>
+      <w:pPr>
+        <w:ind w:firstLine="0"/>
+      </w:pPr>
+      <w:r>
+        <w:t>Discussão das causas prováveis:</w:t>
+      </w:r>
+    </w:p>
+    <w:p>
+      <w:r>
+        <w:t xml:space="preserve">- </w:t>
+      </w:r>
+      <w:r>
+        <w:rPr>
+          <w:b/>
+          <w:bCs/>
+        </w:rPr>
+        <w:t>Falsos positivos:</w:t>
+      </w:r>
+      <w:r>
+        <w:t xml:space="preserve"> marcas circulares em coberturas (caixas d'água, marcações de estacionamento</w:t>
+      </w:r>
+      <w:r>
+        <w:t>, formatos quadrados e etc</w:t>
+      </w:r>
+      <w:r>
+        <w:t>) que se parecem com o padrão do heliponto.</w:t>
+      </w:r>
+    </w:p>
+    <w:p>
+      <w:r>
+        <w:t xml:space="preserve">- </w:t>
+      </w:r>
+      <w:r>
+        <w:rPr>
+          <w:b/>
+          <w:bCs/>
+        </w:rPr>
+        <w:t>Falsos negativos:</w:t>
+      </w:r>
+      <w:r>
+        <w:t xml:space="preserve"> helipontos com sombra, baixo contraste, pintura desgastada ou parcialmente cobertos por equipamentos, além de casos cortados pela borda do bloco.</w:t>
+      </w:r>
+    </w:p>
+    <w:p>
+      <w:r>
+        <w:t>Vale notar que a matriz de confusão é tomada em um limiar fixo de confiança (0,25), mais baixo, enquanto a precisão e a revocação reportadas na Seção 4.1 correspondem ao ponto de operação que maximiza o F1. Essa diferença de limiar explica por que a matriz pode aparentar mais falsos positivos do que a precisão sugere: boa parte desses falsos positivos tem confiança baixa e desaparece ao subir o limiar.</w:t>
+      </w:r>
+    </w:p>
+    <w:p/>
+    <w:p>
+      <w:pPr>
+        <w:pStyle w:val="ListParagraph"/>
+        <w:numPr>
+          <w:ilvl w:val="1"/>
+          <w:numId w:val="4"/>
+        </w:numPr>
+        <w:rPr>
+          <w:rFonts w:ascii="Arial" w:eastAsia="Arial" w:hAnsi="Arial" w:cs="Arial"/>
+          <w:b/>
+          <w:bCs/>
+          <w:sz w:val="24"/>
+          <w:szCs w:val="24"/>
+        </w:rPr>
+      </w:pPr>
+      <w:r>
+        <w:rPr>
+          <w:rFonts w:ascii="Arial" w:eastAsia="Arial" w:hAnsi="Arial" w:cs="Arial"/>
+          <w:b/>
+          <w:bCs/>
+          <w:sz w:val="24"/>
+          <w:szCs w:val="24"/>
+        </w:rPr>
+        <w:t>INFERÊNCIA EM BAIRRO INÉDITO</w:t>
+      </w:r>
+    </w:p>
+    <w:p>
+      <w:r>
+        <w:t>Para verificar a generalização, rodei a inferência sobre os tiles da Avenida Paulista, bairro não usado no treino, e salvei as imagens com as detecções. A Avenida Paulista tem características visuais diferentes das regiões de treino (edifícios mais ntigos, hotéis), o que estressa o modelo e mostra até que ponto ele generaliza para um domínio novo.</w:t>
+      </w:r>
+    </w:p>
+    <w:p>
+      <w:r>
+        <w:rPr>
+          <w:noProof/>
+        </w:rPr>
+        <w:drawing>
+          <wp:anchor distT="0" distB="0" distL="114300" distR="114300" simplePos="0" relativeHeight="251684864" behindDoc="0" locked="0" layoutInCell="1" allowOverlap="1" wp14:anchorId="53EFE012" wp14:editId="0533CAA3">
+            <wp:simplePos x="0" y="0"/>
+            <wp:positionH relativeFrom="page">
+              <wp:posOffset>2250219</wp:posOffset>
+            </wp:positionH>
+            <wp:positionV relativeFrom="paragraph">
+              <wp:posOffset>9442</wp:posOffset>
+            </wp:positionV>
+            <wp:extent cx="3110505" cy="3132814"/>
+            <wp:effectExtent l="0" t="0" r="0" b="0"/>
+            <wp:wrapNone/>
+            <wp:docPr id="1572305504" name="drawing"/>
+            <wp:cNvGraphicFramePr>
+              <a:graphicFrameLocks xmlns:a="http://schemas.openxmlformats.org/drawingml/2006/main" noChangeAspect="1"/>
+            </wp:cNvGraphicFramePr>
+            <a:graphic xmlns:a="http://schemas.openxmlformats.org/drawingml/2006/main">
+              <a:graphicData uri="http://schemas.openxmlformats.org/drawingml/2006/picture">
+                <pic:pic xmlns:pic="http://schemas.openxmlformats.org/drawingml/2006/picture">
+                  <pic:nvPicPr>
+                    <pic:cNvPr id="1572305504" name="Picture 1572305504"/>
                     <pic:cNvPicPr/>
                   </pic:nvPicPr>
                   <pic:blipFill>
-                    <a:blip r:embed="rId18">
+                    <a:blip r:embed="rId23">
                       <a:extLst>
                         <a:ext uri="{28A0092B-C50C-407E-A947-70E740481C1C}">
                           <a14:useLocalDpi xmlns:a14="http://schemas.microsoft.com/office/drawing/2010/main"/>
@@ -5090,7 +5701,7 @@
                   <pic:spPr>
                     <a:xfrm>
                       <a:off x="0" y="0"/>
-                      <a:ext cx="5762625" cy="3924300"/>
+                      <a:ext cx="3116644" cy="3138997"/>
                     </a:xfrm>
                     <a:prstGeom prst="rect">
                       <a:avLst/>
@@ -5109,158 +5720,19 @@
         </w:drawing>
       </w:r>
     </w:p>
-    <w:p>
-      <w:pPr>
-        <w:pStyle w:val="ListParagraph"/>
-        <w:numPr>
-          <w:ilvl w:val="1"/>
-          <w:numId w:val="4"/>
-        </w:numPr>
-        <w:rPr>
-          <w:rFonts w:ascii="Arial" w:eastAsia="Arial" w:hAnsi="Arial" w:cs="Arial"/>
-          <w:b/>
-          <w:bCs/>
-          <w:sz w:val="24"/>
-          <w:szCs w:val="24"/>
-        </w:rPr>
-      </w:pPr>
-      <w:r>
-        <w:rPr>
-          <w:rFonts w:ascii="Arial" w:eastAsia="Arial" w:hAnsi="Arial" w:cs="Arial"/>
-          <w:b/>
-          <w:bCs/>
-          <w:sz w:val="24"/>
-          <w:szCs w:val="24"/>
-        </w:rPr>
-        <w:lastRenderedPageBreak/>
-        <w:t>ANÁLISE DE ERROS</w:t>
-      </w:r>
-    </w:p>
-    <w:p>
-      <w:r>
-        <w:t>Casando as detecções (confiança &gt;= 0,25) com as anotações verdadeiras por IoU &gt;= 0,50, coletei exemplos representativos do comportamento do modelo no teste. A matriz de confusão, no ponto de confiança 0,25, registrou</w:t>
-      </w:r>
-      <w:r>
-        <w:t>:</w:t>
-      </w:r>
-    </w:p>
     <w:p/>
-    <w:p>
-      <w:pPr>
-        <w:keepNext/>
-        <w:ind w:firstLine="0"/>
-        <w:jc w:val="center"/>
-      </w:pPr>
-      <w:r>
-        <w:rPr>
-          <w:noProof/>
-        </w:rPr>
-        <w:drawing>
-          <wp:inline distT="0" distB="0" distL="0" distR="0" wp14:anchorId="582B56FB" wp14:editId="29C0E648">
-            <wp:extent cx="5762625" cy="4324350"/>
-            <wp:effectExtent l="0" t="0" r="0" b="0"/>
-            <wp:docPr id="487151143" name="drawing"/>
-            <wp:cNvGraphicFramePr>
-              <a:graphicFrameLocks xmlns:a="http://schemas.openxmlformats.org/drawingml/2006/main" noChangeAspect="1"/>
-            </wp:cNvGraphicFramePr>
-            <a:graphic xmlns:a="http://schemas.openxmlformats.org/drawingml/2006/main">
-              <a:graphicData uri="http://schemas.openxmlformats.org/drawingml/2006/picture">
-                <pic:pic xmlns:pic="http://schemas.openxmlformats.org/drawingml/2006/picture">
-                  <pic:nvPicPr>
-                    <pic:cNvPr id="487151143" name="Picture 487151143"/>
-                    <pic:cNvPicPr/>
-                  </pic:nvPicPr>
-                  <pic:blipFill>
-                    <a:blip r:embed="rId19">
-                      <a:extLst>
-                        <a:ext uri="{28A0092B-C50C-407E-A947-70E740481C1C}">
-                          <a14:useLocalDpi xmlns:a14="http://schemas.microsoft.com/office/drawing/2010/main"/>
-                        </a:ext>
-                      </a:extLst>
-                    </a:blip>
-                    <a:stretch>
-                      <a:fillRect/>
-                    </a:stretch>
-                  </pic:blipFill>
-                  <pic:spPr>
-                    <a:xfrm>
-                      <a:off x="0" y="0"/>
-                      <a:ext cx="5762625" cy="4324350"/>
-                    </a:xfrm>
-                    <a:prstGeom prst="rect">
-                      <a:avLst/>
-                    </a:prstGeom>
-                  </pic:spPr>
-                </pic:pic>
-              </a:graphicData>
-            </a:graphic>
-          </wp:inline>
-        </w:drawing>
-      </w:r>
-    </w:p>
-    <w:p>
-      <w:pPr>
-        <w:pStyle w:val="Caption"/>
-        <w:rPr>
-          <w:sz w:val="20"/>
-          <w:szCs w:val="20"/>
-        </w:rPr>
-      </w:pPr>
-      <w:r>
-        <w:rPr>
-          <w:sz w:val="20"/>
-          <w:szCs w:val="20"/>
-        </w:rPr>
-        <w:t xml:space="preserve">Figura </w:t>
-      </w:r>
-      <w:r>
-        <w:rPr>
-          <w:sz w:val="20"/>
-          <w:szCs w:val="20"/>
-        </w:rPr>
-        <w:fldChar w:fldCharType="begin"/>
-      </w:r>
-      <w:r>
-        <w:rPr>
-          <w:sz w:val="20"/>
-          <w:szCs w:val="20"/>
-        </w:rPr>
-        <w:instrText xml:space="preserve"> SEQ Figura \* ARABIC </w:instrText>
-      </w:r>
-      <w:r>
-        <w:rPr>
-          <w:sz w:val="20"/>
-          <w:szCs w:val="20"/>
-        </w:rPr>
-        <w:fldChar w:fldCharType="separate"/>
-      </w:r>
-      <w:r>
-        <w:rPr>
-          <w:noProof/>
-          <w:sz w:val="20"/>
-          <w:szCs w:val="20"/>
-        </w:rPr>
-        <w:t>7</w:t>
-      </w:r>
-      <w:r>
-        <w:rPr>
-          <w:sz w:val="20"/>
-          <w:szCs w:val="20"/>
-        </w:rPr>
-        <w:fldChar w:fldCharType="end"/>
-      </w:r>
-      <w:r>
-        <w:rPr>
-          <w:sz w:val="20"/>
-          <w:szCs w:val="20"/>
-        </w:rPr>
-        <w:t xml:space="preserve"> - Matriz de Confusão</w:t>
-      </w:r>
-    </w:p>
-    <w:p>
-      <w:pPr>
-        <w:ind w:firstLine="0"/>
-        <w:jc w:val="center"/>
+    <w:p/>
+    <w:p/>
+    <w:p/>
+    <w:p/>
+    <w:p/>
+    <w:p/>
+    <w:p/>
+    <w:p/>
+    <w:p/>
+    <w:p/>
+    <w:p>
+      <w:pPr>
         <w:rPr>
           <w:rFonts w:eastAsia="Arial" w:cs="Arial"/>
           <w:sz w:val="20"/>
@@ -5269,108 +5741,21 @@
       </w:pPr>
       <w:r>
         <w:rPr>
-          <w:rFonts w:eastAsia="Arial" w:cs="Arial"/>
-          <w:sz w:val="20"/>
-          <w:szCs w:val="20"/>
-        </w:rPr>
-        <w:t xml:space="preserve"> </w:t>
-      </w:r>
-    </w:p>
-    <w:p>
-      <w:pPr>
-        <w:ind w:firstLine="0"/>
-      </w:pPr>
-      <w:r>
-        <w:t>Discussão das causas prováveis:</w:t>
-      </w:r>
-    </w:p>
-    <w:p>
-      <w:r>
-        <w:t xml:space="preserve">- </w:t>
-      </w:r>
-      <w:r>
-        <w:rPr>
-          <w:b/>
-          <w:bCs/>
-        </w:rPr>
-        <w:t>Falsos positivos:</w:t>
-      </w:r>
-      <w:r>
-        <w:t xml:space="preserve"> marcas circulares em coberturas (caixas d'água, claraboias, marcações de estacionamento) que se parecem com o padrão do heliponto.</w:t>
-      </w:r>
-    </w:p>
-    <w:p>
-      <w:r>
-        <w:t xml:space="preserve">- </w:t>
-      </w:r>
-      <w:r>
-        <w:rPr>
-          <w:b/>
-          <w:bCs/>
-        </w:rPr>
-        <w:t>Falsos negativos:</w:t>
-      </w:r>
-      <w:r>
-        <w:t xml:space="preserve"> helipontos com sombra, baixo contraste, pintura desgastada ou parcialmente cobertos por equipamentos, além de casos cortados pela borda do bloco.</w:t>
-      </w:r>
-    </w:p>
-    <w:p/>
-    <w:p/>
-    <w:p>
-      <w:r>
-        <w:lastRenderedPageBreak/>
-        <w:t>Vale notar que a matriz de confusão é tomada em um limiar fixo de confiança (0,25), mais baixo, enquanto a precisão e a revocação reportadas na Seção 4.1 correspondem ao ponto de operação que maximiza o F1. Essa diferença de limiar explica por que a matriz pode aparentar mais falsos positivos do que a precisão sugere: boa parte desses falsos positivos tem confiança baixa e desaparece ao subir o limiar.</w:t>
-      </w:r>
-    </w:p>
-    <w:p>
-      <w:pPr>
-        <w:pStyle w:val="ListParagraph"/>
-        <w:numPr>
-          <w:ilvl w:val="1"/>
-          <w:numId w:val="4"/>
-        </w:numPr>
-        <w:rPr>
-          <w:rFonts w:ascii="Arial" w:eastAsia="Arial" w:hAnsi="Arial" w:cs="Arial"/>
-          <w:b/>
-          <w:bCs/>
-          <w:sz w:val="24"/>
-          <w:szCs w:val="24"/>
-        </w:rPr>
-      </w:pPr>
-      <w:r>
-        <w:rPr>
-          <w:rFonts w:ascii="Arial" w:eastAsia="Arial" w:hAnsi="Arial" w:cs="Arial"/>
-          <w:b/>
-          <w:bCs/>
-          <w:sz w:val="24"/>
-          <w:szCs w:val="24"/>
-        </w:rPr>
-        <w:t>INFERÊNCIA EM BAIRRO INÉDITO</w:t>
-      </w:r>
-    </w:p>
-    <w:p>
-      <w:r>
-        <w:t>Para verificar a generalização, rodei a inferência sobre os tiles da Avenida Paulista, bairro não usado no treino, e salvei as imagens com as detecções. A Avenida Paulista tem características visuais diferentes das regiões de treino (edifícios mais antigos, hotéis), o que estressa o modelo e mostra até que ponto ele generaliza para um domínio novo.</w:t>
-      </w:r>
-    </w:p>
-    <w:p>
-      <w:r>
-        <w:rPr>
           <w:noProof/>
         </w:rPr>
         <mc:AlternateContent>
           <mc:Choice Requires="wps">
             <w:drawing>
-              <wp:anchor distT="0" distB="0" distL="114300" distR="114300" simplePos="0" relativeHeight="251678720" behindDoc="0" locked="0" layoutInCell="1" allowOverlap="1" wp14:anchorId="0BD7965A" wp14:editId="7B4FA61B">
+              <wp:anchor distT="0" distB="0" distL="114300" distR="114300" simplePos="0" relativeHeight="251678720" behindDoc="0" locked="0" layoutInCell="1" allowOverlap="1" wp14:anchorId="0BD7965A" wp14:editId="7E3796DC">
                 <wp:simplePos x="0" y="0"/>
-                <wp:positionH relativeFrom="column">
-                  <wp:posOffset>290195</wp:posOffset>
+                <wp:positionH relativeFrom="page">
+                  <wp:align>center</wp:align>
                 </wp:positionH>
                 <wp:positionV relativeFrom="paragraph">
-                  <wp:posOffset>5128895</wp:posOffset>
+                  <wp:posOffset>12700</wp:posOffset>
                 </wp:positionV>
                 <wp:extent cx="4813935" cy="635"/>
-                <wp:effectExtent l="0" t="0" r="0" b="0"/>
+                <wp:effectExtent l="0" t="0" r="5715" b="9525"/>
                 <wp:wrapSquare wrapText="bothSides"/>
                 <wp:docPr id="879777151" name="Text Box 1"/>
                 <wp:cNvGraphicFramePr/>
@@ -5417,36 +5802,7 @@
                                 <w:sz w:val="20"/>
                                 <w:szCs w:val="20"/>
                               </w:rPr>
-                              <w:fldChar w:fldCharType="begin"/>
-                            </w:r>
-                            <w:r>
-                              <w:rPr>
-                                <w:sz w:val="20"/>
-                                <w:szCs w:val="20"/>
-                              </w:rPr>
-                              <w:instrText xml:space="preserve"> SEQ Figura \* ARABIC </w:instrText>
-                            </w:r>
-                            <w:r>
-                              <w:rPr>
-                                <w:sz w:val="20"/>
-                                <w:szCs w:val="20"/>
-                              </w:rPr>
-                              <w:fldChar w:fldCharType="separate"/>
-                            </w:r>
-                            <w:r>
-                              <w:rPr>
-                                <w:noProof/>
-                                <w:sz w:val="20"/>
-                                <w:szCs w:val="20"/>
-                              </w:rPr>
-                              <w:t>8</w:t>
-                            </w:r>
-                            <w:r>
-                              <w:rPr>
-                                <w:sz w:val="20"/>
-                                <w:szCs w:val="20"/>
-                              </w:rPr>
-                              <w:fldChar w:fldCharType="end"/>
+                              <w:t>11</w:t>
                             </w:r>
                             <w:r>
                               <w:rPr>
@@ -5472,7 +5828,7 @@
           </mc:Choice>
           <mc:Fallback>
             <w:pict>
-              <v:shape w14:anchorId="0BD7965A" id="_x0000_s1032" type="#_x0000_t202" style="position:absolute;left:0;text-align:left;margin-left:22.85pt;margin-top:403.85pt;width:379.05pt;height:.05pt;z-index:251678720;visibility:visible;mso-wrap-style:square;mso-wrap-distance-left:9pt;mso-wrap-distance-top:0;mso-wrap-distance-right:9pt;mso-wrap-distance-bottom:0;mso-position-horizontal:absolute;mso-position-horizontal-relative:text;mso-position-vertical:absolute;mso-position-vertical-relative:text;v-text-anchor:top" o:gfxdata="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" stroked="f">
+              <v:shape w14:anchorId="0BD7965A" id="_x0000_s1032" type="#_x0000_t202" style="position:absolute;left:0;text-align:left;margin-left:0;margin-top:1pt;width:379.05pt;height:.05pt;z-index:251678720;visibility:visible;mso-wrap-style:square;mso-wrap-distance-left:9pt;mso-wrap-distance-top:0;mso-wrap-distance-right:9pt;mso-wrap-distance-bottom:0;mso-position-horizontal:center;mso-position-horizontal-relative:page;mso-position-vertical:absolute;mso-position-vertical-relative:text;v-text-anchor:top" o:gfxdata="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" stroked="f">
                 <v:textbox style="mso-fit-shape-to-text:t" inset="0,0,0,0">
                   <w:txbxContent>
                     <w:p>
@@ -5497,36 +5853,7 @@
                           <w:sz w:val="20"/>
                           <w:szCs w:val="20"/>
                         </w:rPr>
-                        <w:fldChar w:fldCharType="begin"/>
-                      </w:r>
-                      <w:r>
-                        <w:rPr>
-                          <w:sz w:val="20"/>
-                          <w:szCs w:val="20"/>
-                        </w:rPr>
-                        <w:instrText xml:space="preserve"> SEQ Figura \* ARABIC </w:instrText>
-                      </w:r>
-                      <w:r>
-                        <w:rPr>
-                          <w:sz w:val="20"/>
-                          <w:szCs w:val="20"/>
-                        </w:rPr>
-                        <w:fldChar w:fldCharType="separate"/>
-                      </w:r>
-                      <w:r>
-                        <w:rPr>
-                          <w:noProof/>
-                          <w:sz w:val="20"/>
-                          <w:szCs w:val="20"/>
-                        </w:rPr>
-                        <w:t>8</w:t>
-                      </w:r>
-                      <w:r>
-                        <w:rPr>
-                          <w:sz w:val="20"/>
-                          <w:szCs w:val="20"/>
-                        </w:rPr>
-                        <w:fldChar w:fldCharType="end"/>
+                        <w:t>11</w:t>
                       </w:r>
                       <w:r>
                         <w:rPr>
@@ -5538,29 +5865,63 @@
                     </w:p>
                   </w:txbxContent>
                 </v:textbox>
-                <w10:wrap type="square"/>
+                <w10:wrap type="square" anchorx="page"/>
               </v:shape>
             </w:pict>
           </mc:Fallback>
         </mc:AlternateContent>
       </w:r>
-      <w:r>
-        <w:rPr>
-          <w:noProof/>
-        </w:rPr>
+    </w:p>
+    <w:p>
+      <w:pPr>
+        <w:pStyle w:val="Heading2"/>
+      </w:pPr>
+      <w:bookmarkStart w:id="10" w:name="_Toc233160077"/>
+      <w:r>
+        <w:lastRenderedPageBreak/>
+        <w:t>APLICAÇÃO NO STREAMLIT</w:t>
+      </w:r>
+      <w:bookmarkEnd w:id="10"/>
+    </w:p>
+    <w:p>
+      <w:r>
+        <w:t xml:space="preserve">Para melhor visibilidade e teste das funcionalidades, desenvolvi uma aplicação com interface visual em Streamlit, disponível em </w:t>
+      </w:r>
+      <w:hyperlink r:id="rId24">
+        <w:r>
+          <w:rPr>
+            <w:rStyle w:val="Hyperlink"/>
+          </w:rPr>
+          <w:t>mapsyolo26puc.streamlit.app</w:t>
+        </w:r>
+      </w:hyperlink>
+      <w:r>
+        <w:t xml:space="preserve"> e alimentada diretamente pelo repositório GitHub do projeto. A aplicação carrega o melhor modelo e oferece três áreas: uma página de métricas (com a matriz de confusão e as curvas de treino), a inferência em imagens de teste aleatórias exibidas em um carrossel de quatro por vez, e um modo de navegar por um mosaico de bairro com setas desenhadas dentro da própria imagem (zoom fixo, no estilo de mapas interativos), com o modelo detectando helipontos em tempo real na janela visível.</w:t>
+      </w:r>
+    </w:p>
+    <w:p>
+      <w:r>
+        <w:t>A aplicação permite ainda variar o limiar de confiança e o IoU do NMS, na linha da aula de métricas, e oferece a opção de test-time augmentation na inferência. Optei por não incluir upload de imagem para evitar entradas fora do domínio do modelo durante a apresentação.</w:t>
+      </w:r>
+      <w:r>
+        <w:t xml:space="preserve"> </w:t>
+      </w:r>
+    </w:p>
+    <w:p>
+      <w:r>
         <w:drawing>
-          <wp:anchor distT="0" distB="0" distL="114300" distR="114300" simplePos="0" relativeHeight="251660288" behindDoc="0" locked="0" layoutInCell="1" allowOverlap="1" wp14:anchorId="17CB075E" wp14:editId="596C1837">
+          <wp:anchor distT="0" distB="0" distL="114300" distR="114300" simplePos="0" relativeHeight="251686912" behindDoc="0" locked="0" layoutInCell="1" allowOverlap="1" wp14:anchorId="55D538FD" wp14:editId="437B4C34">
             <wp:simplePos x="0" y="0"/>
-            <wp:positionH relativeFrom="page">
-              <wp:align>center</wp:align>
+            <wp:positionH relativeFrom="column">
+              <wp:posOffset>40999</wp:posOffset>
             </wp:positionH>
             <wp:positionV relativeFrom="paragraph">
-              <wp:posOffset>223134</wp:posOffset>
+              <wp:posOffset>10685</wp:posOffset>
             </wp:positionV>
-            <wp:extent cx="4814205" cy="4848902"/>
-            <wp:effectExtent l="0" t="0" r="5715" b="8890"/>
-            <wp:wrapSquare wrapText="bothSides"/>
-            <wp:docPr id="1572305504" name="drawing"/>
+            <wp:extent cx="5589767" cy="2558562"/>
+            <wp:effectExtent l="0" t="0" r="0" b="0"/>
+            <wp:wrapNone/>
+            <wp:docPr id="941317812" name="Picture 1"/>
             <wp:cNvGraphicFramePr>
               <a:graphicFrameLocks xmlns:a="http://schemas.openxmlformats.org/drawingml/2006/main" noChangeAspect="1"/>
             </wp:cNvGraphicFramePr>
@@ -5568,14 +5929,14 @@
               <a:graphicData uri="http://schemas.openxmlformats.org/drawingml/2006/picture">
                 <pic:pic xmlns:pic="http://schemas.openxmlformats.org/drawingml/2006/picture">
                   <pic:nvPicPr>
-                    <pic:cNvPr id="1572305504" name="Picture 1572305504"/>
+                    <pic:cNvPr id="941317812" name=""/>
                     <pic:cNvPicPr/>
                   </pic:nvPicPr>
                   <pic:blipFill>
-                    <a:blip r:embed="rId20">
+                    <a:blip r:embed="rId25" cstate="print">
                       <a:extLst>
                         <a:ext uri="{28A0092B-C50C-407E-A947-70E740481C1C}">
-                          <a14:useLocalDpi xmlns:a14="http://schemas.microsoft.com/office/drawing/2010/main"/>
+                          <a14:useLocalDpi xmlns:a14="http://schemas.microsoft.com/office/drawing/2010/main" val="0"/>
                         </a:ext>
                       </a:extLst>
                     </a:blip>
@@ -5586,7 +5947,7 @@
                   <pic:spPr>
                     <a:xfrm>
                       <a:off x="0" y="0"/>
-                      <a:ext cx="4814205" cy="4848902"/>
+                      <a:ext cx="5591974" cy="2559572"/>
                     </a:xfrm>
                     <a:prstGeom prst="rect">
                       <a:avLst/>
@@ -5595,10 +5956,10 @@
                 </pic:pic>
               </a:graphicData>
             </a:graphic>
-            <wp14:sizeRelH relativeFrom="page">
+            <wp14:sizeRelH relativeFrom="margin">
               <wp14:pctWidth>0</wp14:pctWidth>
             </wp14:sizeRelH>
-            <wp14:sizeRelV relativeFrom="page">
+            <wp14:sizeRelV relativeFrom="margin">
               <wp14:pctHeight>0</wp14:pctHeight>
             </wp14:sizeRelV>
           </wp:anchor>
@@ -5606,75 +5967,43 @@
       </w:r>
     </w:p>
     <w:p/>
-    <w:p>
-      <w:pPr>
-        <w:rPr>
-          <w:rFonts w:eastAsia="Arial" w:cs="Arial"/>
-          <w:sz w:val="20"/>
-          <w:szCs w:val="20"/>
-        </w:rPr>
-      </w:pPr>
-    </w:p>
-    <w:p>
-      <w:pPr>
-        <w:pStyle w:val="Heading2"/>
-      </w:pPr>
-      <w:bookmarkStart w:id="10" w:name="_Toc232830948"/>
-      <w:r>
-        <w:lastRenderedPageBreak/>
-        <w:t>APLICAÇÃO NO STREAMLIT</w:t>
-      </w:r>
-      <w:bookmarkEnd w:id="10"/>
-    </w:p>
-    <w:p>
-      <w:r>
-        <w:t xml:space="preserve">Para melhor visibilidade e teste das funcionalidades, desenvolvi uma aplicação com interface visual em Streamlit, disponível em </w:t>
-      </w:r>
-      <w:hyperlink r:id="rId21">
-        <w:r>
-          <w:rPr>
-            <w:rStyle w:val="Hyperlink"/>
-          </w:rPr>
-          <w:t>mapsyolo26puc.streamlit.app</w:t>
-        </w:r>
-      </w:hyperlink>
-      <w:r>
-        <w:t xml:space="preserve"> e alimentada diretamente pelo repositório GitHub do projeto. A aplicação carrega o melhor modelo e oferece três áreas: uma página de métricas (com a matriz de confusão e as curvas de treino), a inferência em imagens de teste aleatórias exibidas em um carrossel de quatro por vez, e um modo de navegar por um mosaico de bairro com setas desenhadas dentro da própria imagem (zoom fixo, no estilo de mapas interativos), com o modelo detectando helipontos em tempo real na janela visível.</w:t>
-      </w:r>
-    </w:p>
-    <w:p>
-      <w:r>
-        <w:rPr>
-          <w:noProof/>
-        </w:rPr>
+    <w:p/>
+    <w:p/>
+    <w:p/>
+    <w:p/>
+    <w:p/>
+    <w:p/>
+    <w:p/>
+    <w:p>
+      <w:r>
         <w:drawing>
-          <wp:anchor distT="0" distB="0" distL="114300" distR="114300" simplePos="0" relativeHeight="251655168" behindDoc="0" locked="0" layoutInCell="1" allowOverlap="1" wp14:anchorId="1BB7867E" wp14:editId="4E1B582F">
+          <wp:anchor distT="0" distB="0" distL="114300" distR="114300" simplePos="0" relativeHeight="251685888" behindDoc="0" locked="0" layoutInCell="1" allowOverlap="1" wp14:anchorId="3FA86C9A" wp14:editId="36B471B7">
             <wp:simplePos x="0" y="0"/>
-            <wp:positionH relativeFrom="margin">
-              <wp:posOffset>255270</wp:posOffset>
+            <wp:positionH relativeFrom="column">
+              <wp:posOffset>38378</wp:posOffset>
             </wp:positionH>
             <wp:positionV relativeFrom="paragraph">
-              <wp:posOffset>1029970</wp:posOffset>
+              <wp:posOffset>173823</wp:posOffset>
             </wp:positionV>
-            <wp:extent cx="5033010" cy="2289810"/>
+            <wp:extent cx="5589995" cy="2615979"/>
             <wp:effectExtent l="0" t="0" r="0" b="0"/>
-            <wp:wrapSquare wrapText="bothSides"/>
-            <wp:docPr id="580163251" name="drawing"/>
+            <wp:wrapNone/>
+            <wp:docPr id="812727862" name="Picture 1"/>
             <wp:cNvGraphicFramePr>
-              <a:graphicFrameLocks xmlns:a="http://schemas.openxmlformats.org/drawingml/2006/main"/>
+              <a:graphicFrameLocks xmlns:a="http://schemas.openxmlformats.org/drawingml/2006/main" noChangeAspect="1"/>
             </wp:cNvGraphicFramePr>
             <a:graphic xmlns:a="http://schemas.openxmlformats.org/drawingml/2006/main">
               <a:graphicData uri="http://schemas.openxmlformats.org/drawingml/2006/picture">
                 <pic:pic xmlns:pic="http://schemas.openxmlformats.org/drawingml/2006/picture">
                   <pic:nvPicPr>
-                    <pic:cNvPr id="580163251" name="Picture 580163251"/>
+                    <pic:cNvPr id="812727862" name=""/>
                     <pic:cNvPicPr/>
                   </pic:nvPicPr>
                   <pic:blipFill>
-                    <a:blip r:embed="rId22">
+                    <a:blip r:embed="rId26" cstate="print">
                       <a:extLst>
                         <a:ext uri="{28A0092B-C50C-407E-A947-70E740481C1C}">
-                          <a14:useLocalDpi xmlns:a14="http://schemas.microsoft.com/office/drawing/2010/main"/>
+                          <a14:useLocalDpi xmlns:a14="http://schemas.microsoft.com/office/drawing/2010/main" val="0"/>
                         </a:ext>
                       </a:extLst>
                     </a:blip>
@@ -5685,7 +6014,7 @@
                   <pic:spPr>
                     <a:xfrm>
                       <a:off x="0" y="0"/>
-                      <a:ext cx="5033010" cy="2289810"/>
+                      <a:ext cx="5606892" cy="2623886"/>
                     </a:xfrm>
                     <a:prstGeom prst="rect">
                       <a:avLst/>
@@ -5694,23 +6023,28 @@
                 </pic:pic>
               </a:graphicData>
             </a:graphic>
-            <wp14:sizeRelH relativeFrom="page">
+            <wp14:sizeRelH relativeFrom="margin">
               <wp14:pctWidth>0</wp14:pctWidth>
             </wp14:sizeRelH>
-            <wp14:sizeRelV relativeFrom="page">
+            <wp14:sizeRelV relativeFrom="margin">
               <wp14:pctHeight>0</wp14:pctHeight>
             </wp14:sizeRelV>
           </wp:anchor>
         </w:drawing>
       </w:r>
-      <w:r>
-        <w:t>A aplicação permite ainda variar o limiar de confiança e o IoU do NMS, na linha da aula de métricas, e oferece a opção de test-time augmentation na inferência. Optei por não incluir upload de imagem para evitar entradas fora do domínio do modelo durante a apresentação.</w:t>
-      </w:r>
-    </w:p>
+    </w:p>
+    <w:p/>
+    <w:p/>
+    <w:p/>
+    <w:p/>
+    <w:p/>
+    <w:p/>
     <w:p>
       <w:pPr>
         <w:ind w:firstLine="0"/>
       </w:pPr>
+    </w:p>
+    <w:p>
       <w:r>
         <w:rPr>
           <w:noProof/>
@@ -5718,13 +6052,13 @@
         <mc:AlternateContent>
           <mc:Choice Requires="wps">
             <w:drawing>
-              <wp:anchor distT="0" distB="0" distL="114300" distR="114300" simplePos="0" relativeHeight="251680768" behindDoc="0" locked="0" layoutInCell="1" allowOverlap="1" wp14:anchorId="5F0E6345" wp14:editId="3EE99F06">
+              <wp:anchor distT="0" distB="0" distL="114300" distR="114300" simplePos="0" relativeHeight="251680768" behindDoc="0" locked="0" layoutInCell="1" allowOverlap="1" wp14:anchorId="5F0E6345" wp14:editId="523EF547">
                 <wp:simplePos x="0" y="0"/>
                 <wp:positionH relativeFrom="column">
-                  <wp:posOffset>151074</wp:posOffset>
+                  <wp:posOffset>158446</wp:posOffset>
                 </wp:positionH>
                 <wp:positionV relativeFrom="paragraph">
-                  <wp:posOffset>4531691</wp:posOffset>
+                  <wp:posOffset>784059</wp:posOffset>
                 </wp:positionV>
                 <wp:extent cx="5241290" cy="635"/>
                 <wp:effectExtent l="0" t="0" r="0" b="0"/>
@@ -5788,43 +6122,28 @@
                                 <w:sz w:val="20"/>
                                 <w:szCs w:val="20"/>
                               </w:rPr>
-                              <w:fldChar w:fldCharType="begin"/>
+                              <w:t>12</w:t>
                             </w:r>
                             <w:r>
                               <w:rPr>
                                 <w:sz w:val="20"/>
                                 <w:szCs w:val="20"/>
                               </w:rPr>
-                              <w:instrText xml:space="preserve"> SEQ Figura \* ARABIC </w:instrText>
+                              <w:t xml:space="preserve"> e 1</w:t>
                             </w:r>
                             <w:r>
                               <w:rPr>
                                 <w:sz w:val="20"/>
                                 <w:szCs w:val="20"/>
                               </w:rPr>
-                              <w:fldChar w:fldCharType="separate"/>
-                            </w:r>
-                            <w:r>
-                              <w:rPr>
-                                <w:noProof/>
-                                <w:sz w:val="20"/>
-                                <w:szCs w:val="20"/>
-                              </w:rPr>
-                              <w:t>9</w:t>
+                              <w:t>3</w:t>
                             </w:r>
                             <w:r>
                               <w:rPr>
                                 <w:sz w:val="20"/>
                                 <w:szCs w:val="20"/>
                               </w:rPr>
-                              <w:fldChar w:fldCharType="end"/>
-                            </w:r>
-                            <w:r>
-                              <w:rPr>
-                                <w:sz w:val="20"/>
-                                <w:szCs w:val="20"/>
-                              </w:rPr>
-                              <w:t xml:space="preserve"> e 10 - Telas da aplicação Streamlit</w:t>
+                              <w:t xml:space="preserve"> - Telas da aplicação Streamlit</w:t>
                             </w:r>
                           </w:p>
                         </w:txbxContent>
@@ -5843,11 +6162,7 @@
           </mc:Choice>
           <mc:Fallback>
             <w:pict>
-              <v:shapetype w14:anchorId="5F0E6345" id="_x0000_t202" coordsize="21600,21600" o:spt="202" path="m,l,21600r21600,l21600,xe">
-                <v:stroke joinstyle="miter"/>
-                <v:path gradientshapeok="t" o:connecttype="rect"/>
-              </v:shapetype>
-              <v:shape id="_x0000_s1033" type="#_x0000_t202" style="position:absolute;left:0;text-align:left;margin-left:11.9pt;margin-top:356.85pt;width:412.7pt;height:.05pt;z-index:251680768;visibility:visible;mso-wrap-style:square;mso-wrap-distance-left:9pt;mso-wrap-distance-top:0;mso-wrap-distance-right:9pt;mso-wrap-distance-bottom:0;mso-position-horizontal:absolute;mso-position-horizontal-relative:text;mso-position-vertical:absolute;mso-position-vertical-relative:text;v-text-anchor:top" o:gfxdata="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" stroked="f">
+              <v:shape w14:anchorId="5F0E6345" id="_x0000_s1033" type="#_x0000_t202" style="position:absolute;left:0;text-align:left;margin-left:12.5pt;margin-top:61.75pt;width:412.7pt;height:.05pt;z-index:251680768;visibility:visible;mso-wrap-style:square;mso-wrap-distance-left:9pt;mso-wrap-distance-top:0;mso-wrap-distance-right:9pt;mso-wrap-distance-bottom:0;mso-position-horizontal:absolute;mso-position-horizontal-relative:text;mso-position-vertical:absolute;mso-position-vertical-relative:text;v-text-anchor:top" o:gfxdata="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" stroked="f">
                 <v:textbox style="mso-fit-shape-to-text:t" inset="0,0,0,0">
                   <w:txbxContent>
                     <w:p>
@@ -5886,43 +6201,28 @@
                           <w:sz w:val="20"/>
                           <w:szCs w:val="20"/>
                         </w:rPr>
-                        <w:fldChar w:fldCharType="begin"/>
+                        <w:t>12</w:t>
                       </w:r>
                       <w:r>
                         <w:rPr>
                           <w:sz w:val="20"/>
                           <w:szCs w:val="20"/>
                         </w:rPr>
-                        <w:instrText xml:space="preserve"> SEQ Figura \* ARABIC </w:instrText>
+                        <w:t xml:space="preserve"> e 1</w:t>
                       </w:r>
                       <w:r>
                         <w:rPr>
                           <w:sz w:val="20"/>
                           <w:szCs w:val="20"/>
                         </w:rPr>
-                        <w:fldChar w:fldCharType="separate"/>
-                      </w:r>
-                      <w:r>
-                        <w:rPr>
-                          <w:noProof/>
-                          <w:sz w:val="20"/>
-                          <w:szCs w:val="20"/>
-                        </w:rPr>
-                        <w:t>9</w:t>
+                        <w:t>3</w:t>
                       </w:r>
                       <w:r>
                         <w:rPr>
                           <w:sz w:val="20"/>
                           <w:szCs w:val="20"/>
                         </w:rPr>
-                        <w:fldChar w:fldCharType="end"/>
-                      </w:r>
-                      <w:r>
-                        <w:rPr>
-                          <w:sz w:val="20"/>
-                          <w:szCs w:val="20"/>
-                        </w:rPr>
-                        <w:t xml:space="preserve"> e 10 - Telas da aplicação Streamlit</w:t>
+                        <w:t xml:space="preserve"> - Telas da aplicação Streamlit</w:t>
                       </w:r>
                     </w:p>
                   </w:txbxContent>
@@ -5933,73 +6233,12 @@
           </mc:Fallback>
         </mc:AlternateContent>
       </w:r>
-      <w:r>
-        <w:rPr>
-          <w:noProof/>
-        </w:rPr>
-        <w:drawing>
-          <wp:anchor distT="0" distB="0" distL="114300" distR="114300" simplePos="0" relativeHeight="251658240" behindDoc="0" locked="0" layoutInCell="1" allowOverlap="1" wp14:anchorId="30B95CB2" wp14:editId="77A15F94">
-            <wp:simplePos x="0" y="0"/>
-            <wp:positionH relativeFrom="margin">
-              <wp:posOffset>255270</wp:posOffset>
-            </wp:positionH>
-            <wp:positionV relativeFrom="paragraph">
-              <wp:posOffset>2268220</wp:posOffset>
-            </wp:positionV>
-            <wp:extent cx="5033010" cy="2194560"/>
-            <wp:effectExtent l="0" t="0" r="0" b="0"/>
-            <wp:wrapSquare wrapText="bothSides"/>
-            <wp:docPr id="1195851590" name="drawing"/>
-            <wp:cNvGraphicFramePr>
-              <a:graphicFrameLocks xmlns:a="http://schemas.openxmlformats.org/drawingml/2006/main"/>
-            </wp:cNvGraphicFramePr>
-            <a:graphic xmlns:a="http://schemas.openxmlformats.org/drawingml/2006/main">
-              <a:graphicData uri="http://schemas.openxmlformats.org/drawingml/2006/picture">
-                <pic:pic xmlns:pic="http://schemas.openxmlformats.org/drawingml/2006/picture">
-                  <pic:nvPicPr>
-                    <pic:cNvPr id="1195851590" name="Picture 1195851590"/>
-                    <pic:cNvPicPr/>
-                  </pic:nvPicPr>
-                  <pic:blipFill>
-                    <a:blip r:embed="rId23">
-                      <a:extLst>
-                        <a:ext uri="{28A0092B-C50C-407E-A947-70E740481C1C}">
-                          <a14:useLocalDpi xmlns:a14="http://schemas.microsoft.com/office/drawing/2010/main"/>
-                        </a:ext>
-                      </a:extLst>
-                    </a:blip>
-                    <a:stretch>
-                      <a:fillRect/>
-                    </a:stretch>
-                  </pic:blipFill>
-                  <pic:spPr>
-                    <a:xfrm>
-                      <a:off x="0" y="0"/>
-                      <a:ext cx="5033010" cy="2194560"/>
-                    </a:xfrm>
-                    <a:prstGeom prst="rect">
-                      <a:avLst/>
-                    </a:prstGeom>
-                  </pic:spPr>
-                </pic:pic>
-              </a:graphicData>
-            </a:graphic>
-            <wp14:sizeRelH relativeFrom="page">
-              <wp14:pctWidth>0</wp14:pctWidth>
-            </wp14:sizeRelH>
-            <wp14:sizeRelV relativeFrom="page">
-              <wp14:pctHeight>0</wp14:pctHeight>
-            </wp14:sizeRelV>
-          </wp:anchor>
-        </w:drawing>
-      </w:r>
-    </w:p>
-    <w:p/>
+    </w:p>
     <w:p>
       <w:pPr>
         <w:pStyle w:val="Heading2"/>
       </w:pPr>
-      <w:bookmarkStart w:id="11" w:name="_Toc232830949"/>
+      <w:bookmarkStart w:id="11" w:name="_Toc233160078"/>
       <w:r>
         <w:lastRenderedPageBreak/>
         <w:t>CONCLUSÕES</w:t>
@@ -6011,26 +6250,28 @@
         <w:t xml:space="preserve">O projeto cobriu o ciclo completo de um detector de objetos em imagens de satélite, com ênfase na construção e curadoria do dataset. </w:t>
       </w:r>
       <w:r>
-        <w:rPr>
-          <w:highlight w:val="yellow"/>
-        </w:rPr>
-        <w:t>No conjunto de teste (Avenida Paulista, bairro inédito), o modelo principal (YOLO26n) encontrou cerca de [PREENCHER: %] dos helipontos (revocação [PREENCHER]) com precisão de [PREENCHER] e mAP@0.5 de [PREENCHER],</w:t>
-      </w:r>
-      <w:r>
-        <w:t xml:space="preserve"> generalizando para um bairro não visto e com visual diferente. A divisão por bairro (holdout geográfico) forneceu uma medida honesta de generalização.</w:t>
-      </w:r>
-    </w:p>
-    <w:p>
-      <w:r>
-        <w:t>A principal lição confirmada foi a de que a qualidade dos dados, e não a troca de arquitetura, é o que mais move o resultado em um projeto com poucos exemplos: o maior ganho observado veio da ampliação e do direcionamento da coleta para os casos de erro, e não de mudanças no modelo.</w:t>
-      </w:r>
-    </w:p>
-    <w:p>
-      <w:r>
-        <w:t>As ferramentas de IA generativa foram utilizadas como apoio na construção dos notebooks, da aplicação Streamlit e na revisão pontual de código e texto. A definição do alvo, a coleta, a anotação, as decisões técnicas e a análise dos resultados foram de minha autoria, com base nos conteúdos abordados em sala de aula.</w:t>
-      </w:r>
-    </w:p>
-    <w:p/>
+        <w:t xml:space="preserve">No conjunto de teste (Avenida Paulista, bairro inédito), o modelo principal (YOLO26n) </w:t>
+      </w:r>
+      <w:r>
+        <w:t>encontrou cerca de 82% dos helipontos (revocação 0,817), com precisão de 0,710 e mAP@0.5 de 0,709. A arquitetura de comparação (YOLO11n) atingiu mAP@0.5 de 0,781 e precisão de 0,869 no mesmo teste, ficando à frente nesta versão do dataset</w:t>
+      </w:r>
+      <w:r>
+        <w:t>,</w:t>
+      </w:r>
+      <w:r>
+        <w:t xml:space="preserve"> diferença dentro da margem de variância de um teste pequeno. A divisão por bairro forneceu uma medida honesta de generalização.</w:t>
+      </w:r>
+    </w:p>
+    <w:p>
+      <w:r>
+        <w:t>A principal lição confirmada foi a de que o resultado é limitado pelos dados, e não pela arquitetura: trocar de modelo (nano entre YOLO26 e YOLO11) ou ampliarmarginalmente a base não moveu o resultado de forma significativa. Ganhos reais dependeriam de um aumento substancial do volume de dados anotados.</w:t>
+      </w:r>
+    </w:p>
+    <w:p>
+      <w:r>
+        <w:t>As ferramentas de IA generativa foram utilizadas como apoio na construção da aplicação Streamlit e na revisão pontual de código e texto. A definição do alvo, a coleta, a anotação, as decisões técnicas e a análise dos resultados foram de minha autoria, com base nos conteúdos abordados em sala de aula.</w:t>
+      </w:r>
+    </w:p>
     <w:p>
       <w:pPr>
         <w:pStyle w:val="Heading6"/>
@@ -6041,7 +6282,7 @@
       <w:bookmarkStart w:id="12" w:name="_Toc79652176"/>
       <w:bookmarkStart w:id="13" w:name="_Toc81325008"/>
       <w:bookmarkStart w:id="14" w:name="_Toc81325093"/>
-      <w:bookmarkStart w:id="15" w:name="_Toc232830950"/>
+      <w:bookmarkStart w:id="15" w:name="_Toc233160079"/>
       <w:r>
         <w:rPr>
           <w:color w:val="auto"/>
@@ -6205,7 +6446,7 @@
       </w:pPr>
     </w:p>
     <w:sectPr>
-      <w:headerReference w:type="default" r:id="rId24"/>
+      <w:headerReference w:type="default" r:id="rId27"/>
       <w:pgSz w:w="11906" w:h="16838"/>
       <w:pgMar w:top="1701" w:right="1134" w:bottom="1134" w:left="1701" w:header="708" w:footer="708" w:gutter="0"/>
       <w:pgNumType w:start="1"/>
@@ -7911,7 +8152,6 @@
   <w:style w:type="character" w:default="1" w:styleId="DefaultParagraphFont">
     <w:name w:val="Default Paragraph Font"/>
     <w:uiPriority w:val="1"/>
-    <w:semiHidden/>
     <w:unhideWhenUsed/>
   </w:style>
   <w:style w:type="table" w:default="1" w:styleId="TableNormal">
@@ -9069,6 +9309,15 @@
 </file>
 
 <file path=customXml/item1.xml><?xml version="1.0" encoding="utf-8"?>
+<?mso-contentType ?>
+<FormTemplates xmlns="http://schemas.microsoft.com/sharepoint/v3/contenttype/forms">
+  <Display>DocumentLibraryForm</Display>
+  <Edit>DocumentLibraryForm</Edit>
+  <New>DocumentLibraryForm</New>
+</FormTemplates>
+</file>
+
+<file path=customXml/item2.xml><?xml version="1.0" encoding="utf-8"?>
 <ct:contentTypeSchema xmlns:ct="http://schemas.microsoft.com/office/2006/metadata/contentType" xmlns:ma="http://schemas.microsoft.com/office/2006/metadata/properties/metaAttributes" ct:_="" ma:_="" ma:contentTypeName="Documento" ma:contentTypeID="0x010100441347D372B1684CA0871D8010662EE7" ma:contentTypeVersion="7" ma:contentTypeDescription="Crie um novo documento." ma:contentTypeScope="" ma:versionID="c9a102eed51b747df849c76f4d9f365e">
   <xsd:schema xmlns:xsd="http://www.w3.org/2001/XMLSchema" xmlns:xs="http://www.w3.org/2001/XMLSchema" xmlns:p="http://schemas.microsoft.com/office/2006/metadata/properties" xmlns:ns2="2bf709f8-ce30-4c8d-be0a-05136b9d1faf" targetNamespace="http://schemas.microsoft.com/office/2006/metadata/properties" ma:root="true" ma:fieldsID="517974d091d131e2e43bcc9ca6206513" ns2:_="">
     <xsd:import namespace="2bf709f8-ce30-4c8d-be0a-05136b9d1faf"/>
@@ -9232,26 +9481,25 @@
 </ct:contentTypeSchema>
 </file>
 
-<file path=customXml/item2.xml><?xml version="1.0" encoding="utf-8"?>
-<?mso-contentType ?>
-<FormTemplates xmlns="http://schemas.microsoft.com/sharepoint/v3/contenttype/forms">
-  <Display>DocumentLibraryForm</Display>
-  <Edit>DocumentLibraryForm</Edit>
-  <New>DocumentLibraryForm</New>
-</FormTemplates>
+<file path=customXml/item3.xml><?xml version="1.0" encoding="utf-8"?>
+<b:Sources xmlns:b="http://schemas.openxmlformats.org/officeDocument/2006/bibliography" xmlns="http://schemas.openxmlformats.org/officeDocument/2006/bibliography" SelectedStyle="\APASixthEditionOfficeOnline.xsl" StyleName="APA" Version="6"/>
 </file>
 
-<file path=customXml/item3.xml><?xml version="1.0" encoding="utf-8"?>
+<file path=customXml/item4.xml><?xml version="1.0" encoding="utf-8"?>
 <p:properties xmlns:p="http://schemas.microsoft.com/office/2006/metadata/properties" xmlns:xsi="http://www.w3.org/2001/XMLSchema-instance" xmlns:pc="http://schemas.microsoft.com/office/infopath/2007/PartnerControls">
   <documentManagement/>
 </p:properties>
 </file>
 
-<file path=customXml/item4.xml><?xml version="1.0" encoding="utf-8"?>
-<b:Sources xmlns:b="http://schemas.openxmlformats.org/officeDocument/2006/bibliography" xmlns="http://schemas.openxmlformats.org/officeDocument/2006/bibliography" SelectedStyle="\APASixthEditionOfficeOnline.xsl" StyleName="APA" Version="6"/>
+<file path=customXml/itemProps1.xml><?xml version="1.0" encoding="utf-8"?>
+<ds:datastoreItem xmlns:ds="http://schemas.openxmlformats.org/officeDocument/2006/customXml" ds:itemID="{FE9D23DB-2816-4719-8003-AA2718D8FA81}">
+  <ds:schemaRefs>
+    <ds:schemaRef ds:uri="http://schemas.microsoft.com/sharepoint/v3/contenttype/forms"/>
+  </ds:schemaRefs>
+</ds:datastoreItem>
 </file>
 
-<file path=customXml/itemProps1.xml><?xml version="1.0" encoding="utf-8"?>
+<file path=customXml/itemProps2.xml><?xml version="1.0" encoding="utf-8"?>
 <ds:datastoreItem xmlns:ds="http://schemas.openxmlformats.org/officeDocument/2006/customXml" ds:itemID="{5DAC3D86-4755-4386-9EAA-D0A74BA7C06B}">
   <ds:schemaRefs>
     <ds:schemaRef ds:uri="http://schemas.microsoft.com/office/2006/metadata/contentType"/>
@@ -9269,27 +9517,19 @@
 </ds:datastoreItem>
 </file>
 
-<file path=customXml/itemProps2.xml><?xml version="1.0" encoding="utf-8"?>
-<ds:datastoreItem xmlns:ds="http://schemas.openxmlformats.org/officeDocument/2006/customXml" ds:itemID="{FE9D23DB-2816-4719-8003-AA2718D8FA81}">
+<file path=customXml/itemProps3.xml><?xml version="1.0" encoding="utf-8"?>
+<ds:datastoreItem xmlns:ds="http://schemas.openxmlformats.org/officeDocument/2006/customXml" ds:itemID="{2EA2D8AB-3F44-43F6-AD76-6DBE3F678E3B}">
   <ds:schemaRefs>
-    <ds:schemaRef ds:uri="http://schemas.microsoft.com/sharepoint/v3/contenttype/forms"/>
+    <ds:schemaRef ds:uri="http://schemas.openxmlformats.org/officeDocument/2006/bibliography"/>
   </ds:schemaRefs>
 </ds:datastoreItem>
 </file>
 
-<file path=customXml/itemProps3.xml><?xml version="1.0" encoding="utf-8"?>
+<file path=customXml/itemProps4.xml><?xml version="1.0" encoding="utf-8"?>
 <ds:datastoreItem xmlns:ds="http://schemas.openxmlformats.org/officeDocument/2006/customXml" ds:itemID="{BD5B7501-A9AF-4DF5-95C4-E355D43DE9C0}">
   <ds:schemaRefs>
     <ds:schemaRef ds:uri="http://schemas.microsoft.com/office/2006/metadata/properties"/>
     <ds:schemaRef ds:uri="http://schemas.microsoft.com/office/infopath/2007/PartnerControls"/>
   </ds:schemaRefs>
 </ds:datastoreItem>
-</file>
-
-<file path=customXml/itemProps4.xml><?xml version="1.0" encoding="utf-8"?>
-<ds:datastoreItem xmlns:ds="http://schemas.openxmlformats.org/officeDocument/2006/customXml" ds:itemID="{2EA2D8AB-3F44-43F6-AD76-6DBE3F678E3B}">
-  <ds:schemaRefs>
-    <ds:schemaRef ds:uri="http://schemas.openxmlformats.org/officeDocument/2006/bibliography"/>
-  </ds:schemaRefs>
-</ds:datastoreItem>
 </file>
</xml_diff>